<commit_message>
Update research project outputs
</commit_message>
<xml_diff>
--- a/Research in Econ Project - Notes.docx
+++ b/Research in Econ Project - Notes.docx
@@ -537,7 +537,15 @@
     <w:sdt>
       <w:sdtPr>
         <w:rPr>
-          <w:rFonts w:ascii="Times New Roman" w:hAnsi="Times New Roman" w:cs="Times New Roman"/>
+          <w:rFonts w:ascii="Times New Roman" w:eastAsiaTheme="minorHAnsi" w:hAnsi="Times New Roman" w:cs="Times New Roman"/>
+          <w:b w:val="0"/>
+          <w:bCs w:val="0"/>
+          <w:color w:val="auto"/>
+          <w:kern w:val="2"/>
+          <w:sz w:val="24"/>
+          <w:szCs w:val="24"/>
+          <w:lang w:val="en-GB"/>
+          <w14:ligatures w14:val="standardContextual"/>
         </w:rPr>
         <w:id w:val="183108915"/>
         <w:docPartObj>
@@ -547,14 +555,7 @@
       </w:sdtPr>
       <w:sdtEndPr>
         <w:rPr>
-          <w:rFonts w:eastAsiaTheme="minorHAnsi"/>
           <w:noProof/>
-          <w:color w:val="auto"/>
-          <w:kern w:val="2"/>
-          <w:sz w:val="24"/>
-          <w:szCs w:val="24"/>
-          <w:lang w:val="en-GB"/>
-          <w14:ligatures w14:val="standardContextual"/>
         </w:rPr>
       </w:sdtEndPr>
       <w:sdtContent>
@@ -3687,19 +3688,7 @@
         <w:rPr>
           <w:color w:val="000000"/>
         </w:rPr>
-        <w:t>The institutional cycle material is perfect for this subsection</w:t>
-      </w:r>
-      <w:r>
-        <w:rPr>
-          <w:color w:val="000000"/>
-        </w:rPr>
-        <w:t xml:space="preserve"> (3.3)</w:t>
-      </w:r>
-      <w:r>
-        <w:rPr>
-          <w:color w:val="000000"/>
-        </w:rPr>
-        <w:t>. Specifically: BoE mandate (inflation targeting since 1997, 2.5% target until 2003 then 2% on CPI), MPC structure and voting, pre-2015 communication schedule (Inflation Report quarterly, two weeks after Bank Rate decision, press conference, minutes released two weeks later), August 2015 move to Super Thursday with six-week cycle and simultaneous release of decision/statement/minutes/MPR. This is exactly what Section 3.3 needs.</w:t>
+        <w:t>The institutional cycle material is perfect for this subsection (3.3). Specifically: BoE mandate (inflation targeting since 1997, 2.5% target until 2003 then 2% on CPI), MPC structure and voting, pre-2015 communication schedule (Inflation Report quarterly, two weeks after Bank Rate decision, press conference, minutes released two weeks later), August 2015 move to Super Thursday with six-week cycle and simultaneous release of decision/statement/minutes/MPR. This is exactly what Section 3.3 needs.</w:t>
       </w:r>
     </w:p>
     <w:p>
@@ -4389,7 +4378,7 @@
           <w:szCs w:val="22"/>
         </w:rPr>
         <w:drawing>
-          <wp:inline distT="0" distB="0" distL="0" distR="0" wp14:anchorId="4EB1A422" wp14:editId="0FF28778">
+          <wp:inline distT="0" distB="0" distL="0" distR="0" wp14:anchorId="4EB1A422" wp14:editId="1F92ECC8">
             <wp:extent cx="5943600" cy="1365250"/>
             <wp:effectExtent l="0" t="0" r="0" b="6350"/>
             <wp:docPr id="1812874966" name="Picture 1" descr="A screenshot of a phone&#10;&#10;AI-generated content may be incorrect."/>
@@ -14152,6 +14141,2260 @@
           <w:kern w:val="0"/>
           <w:sz w:val="22"/>
           <w:szCs w:val="22"/>
+        </w:rPr>
+      </w:pPr>
+    </w:p>
+    <w:p>
+      <w:pPr>
+        <w:rPr>
+          <w:rFonts w:ascii="Times New Roman" w:hAnsi="Times New Roman" w:cs="Times New Roman"/>
+          <w:b/>
+          <w:bCs/>
+          <w:kern w:val="0"/>
+          <w:sz w:val="22"/>
+          <w:szCs w:val="22"/>
+        </w:rPr>
+      </w:pPr>
+      <w:r>
+        <w:rPr>
+          <w:rFonts w:ascii="Times New Roman" w:hAnsi="Times New Roman" w:cs="Times New Roman"/>
+          <w:b/>
+          <w:bCs/>
+          <w:kern w:val="0"/>
+          <w:sz w:val="22"/>
+          <w:szCs w:val="22"/>
+        </w:rPr>
+        <w:br w:type="page"/>
+      </w:r>
+    </w:p>
+    <w:p>
+      <w:pPr>
+        <w:autoSpaceDE w:val="0"/>
+        <w:autoSpaceDN w:val="0"/>
+        <w:adjustRightInd w:val="0"/>
+        <w:spacing w:after="0" w:line="240" w:lineRule="auto"/>
+        <w:rPr>
+          <w:rFonts w:ascii="Times New Roman" w:eastAsia="MS Gothic" w:hAnsi="Times New Roman" w:cs="Times New Roman"/>
+          <w:kern w:val="0"/>
+        </w:rPr>
+      </w:pPr>
+      <w:r>
+        <w:rPr>
+          <w:rFonts w:ascii="Times New Roman" w:hAnsi="Times New Roman" w:cs="Times New Roman"/>
+          <w:b/>
+          <w:bCs/>
+          <w:kern w:val="0"/>
+        </w:rPr>
+        <w:lastRenderedPageBreak/>
+        <w:t>What You’re Doing</w:t>
+      </w:r>
+    </w:p>
+    <w:p>
+      <w:pPr>
+        <w:autoSpaceDE w:val="0"/>
+        <w:autoSpaceDN w:val="0"/>
+        <w:adjustRightInd w:val="0"/>
+        <w:spacing w:after="0" w:line="240" w:lineRule="auto"/>
+        <w:rPr>
+          <w:rFonts w:ascii="Times New Roman" w:hAnsi="Times New Roman" w:cs="Times New Roman"/>
+          <w:kern w:val="0"/>
+          <w:sz w:val="22"/>
+          <w:szCs w:val="22"/>
+        </w:rPr>
+      </w:pPr>
+      <w:r>
+        <w:rPr>
+          <w:rFonts w:ascii="Times New Roman" w:hAnsi="Times New Roman" w:cs="Times New Roman"/>
+          <w:kern w:val="0"/>
+          <w:sz w:val="22"/>
+          <w:szCs w:val="22"/>
+        </w:rPr>
+        <w:t>You are estimating how UK equity returns respond to monetary policy surprises from the UK monetary policy event-study database. The core method is daily local projections:</w:t>
+      </w:r>
+    </w:p>
+    <w:p>
+      <w:pPr>
+        <w:autoSpaceDE w:val="0"/>
+        <w:autoSpaceDN w:val="0"/>
+        <w:adjustRightInd w:val="0"/>
+        <w:spacing w:after="0" w:line="240" w:lineRule="auto"/>
+        <w:rPr>
+          <w:rFonts w:ascii="Times New Roman" w:hAnsi="Times New Roman" w:cs="Times New Roman"/>
+          <w:kern w:val="0"/>
+          <w:sz w:val="22"/>
+          <w:szCs w:val="22"/>
+        </w:rPr>
+      </w:pPr>
+      <w:r>
+        <w:rPr>
+          <w:rFonts w:ascii="Times New Roman" w:hAnsi="Times New Roman" w:cs="Times New Roman"/>
+          <w:kern w:val="0"/>
+          <w:sz w:val="22"/>
+          <w:szCs w:val="22"/>
+        </w:rPr>
+        <w:t>future cumulative FTSE return over horizon h</w:t>
+      </w:r>
+      <w:r>
+        <w:rPr>
+          <w:rFonts w:ascii="Times New Roman" w:hAnsi="Times New Roman" w:cs="Times New Roman"/>
+          <w:kern w:val="0"/>
+          <w:sz w:val="22"/>
+          <w:szCs w:val="22"/>
+        </w:rPr>
+        <w:t xml:space="preserve"> </w:t>
+      </w:r>
+      <w:r>
+        <w:rPr>
+          <w:rFonts w:ascii="Times New Roman" w:hAnsi="Times New Roman" w:cs="Times New Roman"/>
+          <w:kern w:val="0"/>
+          <w:sz w:val="22"/>
+          <w:szCs w:val="22"/>
+        </w:rPr>
+        <w:t>= monetary policy shock today + lagged equity returns + controls</w:t>
+      </w:r>
+    </w:p>
+    <w:p>
+      <w:pPr>
+        <w:autoSpaceDE w:val="0"/>
+        <w:autoSpaceDN w:val="0"/>
+        <w:adjustRightInd w:val="0"/>
+        <w:spacing w:after="0" w:line="240" w:lineRule="auto"/>
+        <w:rPr>
+          <w:rFonts w:ascii="Times New Roman" w:hAnsi="Times New Roman" w:cs="Times New Roman"/>
+          <w:kern w:val="0"/>
+          <w:sz w:val="22"/>
+          <w:szCs w:val="22"/>
+        </w:rPr>
+      </w:pPr>
+      <w:r>
+        <w:rPr>
+          <w:rFonts w:ascii="Times New Roman" w:hAnsi="Times New Roman" w:cs="Times New Roman"/>
+          <w:kern w:val="0"/>
+          <w:sz w:val="22"/>
+          <w:szCs w:val="22"/>
+        </w:rPr>
+        <w:t>The shocks are split into three components:</w:t>
+      </w:r>
+    </w:p>
+    <w:p>
+      <w:pPr>
+        <w:pStyle w:val="ListParagraph"/>
+        <w:numPr>
+          <w:ilvl w:val="0"/>
+          <w:numId w:val="20"/>
+        </w:numPr>
+        <w:autoSpaceDE w:val="0"/>
+        <w:autoSpaceDN w:val="0"/>
+        <w:adjustRightInd w:val="0"/>
+        <w:spacing w:after="0" w:line="240" w:lineRule="auto"/>
+        <w:rPr>
+          <w:rFonts w:ascii="Times New Roman" w:hAnsi="Times New Roman" w:cs="Times New Roman"/>
+          <w:kern w:val="0"/>
+          <w:sz w:val="22"/>
+          <w:szCs w:val="22"/>
+        </w:rPr>
+      </w:pPr>
+      <w:r>
+        <w:rPr>
+          <w:rFonts w:ascii="Times New Roman" w:hAnsi="Times New Roman" w:cs="Times New Roman"/>
+          <w:kern w:val="0"/>
+          <w:sz w:val="22"/>
+          <w:szCs w:val="22"/>
+        </w:rPr>
+        <w:t>target: surprise in the current or near-term policy rate, closest to conventional rate news.</w:t>
+      </w:r>
+    </w:p>
+    <w:p>
+      <w:pPr>
+        <w:pStyle w:val="ListParagraph"/>
+        <w:numPr>
+          <w:ilvl w:val="0"/>
+          <w:numId w:val="20"/>
+        </w:numPr>
+        <w:autoSpaceDE w:val="0"/>
+        <w:autoSpaceDN w:val="0"/>
+        <w:adjustRightInd w:val="0"/>
+        <w:spacing w:after="0" w:line="240" w:lineRule="auto"/>
+        <w:rPr>
+          <w:rFonts w:ascii="Times New Roman" w:hAnsi="Times New Roman" w:cs="Times New Roman"/>
+          <w:kern w:val="0"/>
+          <w:sz w:val="22"/>
+          <w:szCs w:val="22"/>
+        </w:rPr>
+      </w:pPr>
+      <w:r>
+        <w:rPr>
+          <w:rFonts w:ascii="Times New Roman" w:hAnsi="Times New Roman" w:cs="Times New Roman"/>
+          <w:kern w:val="0"/>
+          <w:sz w:val="22"/>
+          <w:szCs w:val="22"/>
+        </w:rPr>
+        <w:t>path: surprise about the expected future policy path.</w:t>
+      </w:r>
+    </w:p>
+    <w:p>
+      <w:pPr>
+        <w:pStyle w:val="ListParagraph"/>
+        <w:numPr>
+          <w:ilvl w:val="0"/>
+          <w:numId w:val="20"/>
+        </w:numPr>
+        <w:autoSpaceDE w:val="0"/>
+        <w:autoSpaceDN w:val="0"/>
+        <w:adjustRightInd w:val="0"/>
+        <w:spacing w:after="0" w:line="240" w:lineRule="auto"/>
+        <w:rPr>
+          <w:rFonts w:ascii="Times New Roman" w:hAnsi="Times New Roman" w:cs="Times New Roman"/>
+          <w:kern w:val="0"/>
+          <w:sz w:val="22"/>
+          <w:szCs w:val="22"/>
+        </w:rPr>
+      </w:pPr>
+      <w:proofErr w:type="spellStart"/>
+      <w:r>
+        <w:rPr>
+          <w:rFonts w:ascii="Times New Roman" w:hAnsi="Times New Roman" w:cs="Times New Roman"/>
+          <w:kern w:val="0"/>
+          <w:sz w:val="22"/>
+          <w:szCs w:val="22"/>
+        </w:rPr>
+        <w:t>qe</w:t>
+      </w:r>
+      <w:proofErr w:type="spellEnd"/>
+      <w:r>
+        <w:rPr>
+          <w:rFonts w:ascii="Times New Roman" w:hAnsi="Times New Roman" w:cs="Times New Roman"/>
+          <w:kern w:val="0"/>
+          <w:sz w:val="22"/>
+          <w:szCs w:val="22"/>
+        </w:rPr>
+        <w:t>: asset-purchase or balance-sheet news.</w:t>
+      </w:r>
+    </w:p>
+    <w:p>
+      <w:pPr>
+        <w:autoSpaceDE w:val="0"/>
+        <w:autoSpaceDN w:val="0"/>
+        <w:adjustRightInd w:val="0"/>
+        <w:spacing w:after="0" w:line="240" w:lineRule="auto"/>
+        <w:rPr>
+          <w:rFonts w:ascii="Times New Roman" w:hAnsi="Times New Roman" w:cs="Times New Roman"/>
+          <w:kern w:val="0"/>
+          <w:sz w:val="22"/>
+          <w:szCs w:val="22"/>
+        </w:rPr>
+      </w:pPr>
+      <w:r>
+        <w:rPr>
+          <w:rFonts w:ascii="Times New Roman" w:hAnsi="Times New Roman" w:cs="Times New Roman"/>
+          <w:kern w:val="0"/>
+          <w:sz w:val="22"/>
+          <w:szCs w:val="22"/>
+        </w:rPr>
+        <w:t>Each shock is then separated into tightening and easing magnitudes:</w:t>
+      </w:r>
+    </w:p>
+    <w:p>
+      <w:pPr>
+        <w:pStyle w:val="ListParagraph"/>
+        <w:numPr>
+          <w:ilvl w:val="0"/>
+          <w:numId w:val="20"/>
+        </w:numPr>
+        <w:autoSpaceDE w:val="0"/>
+        <w:autoSpaceDN w:val="0"/>
+        <w:adjustRightInd w:val="0"/>
+        <w:spacing w:after="0" w:line="240" w:lineRule="auto"/>
+        <w:rPr>
+          <w:rFonts w:ascii="Times New Roman" w:hAnsi="Times New Roman" w:cs="Times New Roman"/>
+          <w:kern w:val="0"/>
+          <w:sz w:val="22"/>
+          <w:szCs w:val="22"/>
+        </w:rPr>
+      </w:pPr>
+      <w:r>
+        <w:rPr>
+          <w:rFonts w:ascii="Times New Roman" w:hAnsi="Times New Roman" w:cs="Times New Roman"/>
+          <w:kern w:val="0"/>
+          <w:sz w:val="22"/>
+          <w:szCs w:val="22"/>
+        </w:rPr>
+        <w:t>tightening: the positive part of the shock.</w:t>
+      </w:r>
+    </w:p>
+    <w:p>
+      <w:pPr>
+        <w:pStyle w:val="ListParagraph"/>
+        <w:numPr>
+          <w:ilvl w:val="0"/>
+          <w:numId w:val="20"/>
+        </w:numPr>
+        <w:autoSpaceDE w:val="0"/>
+        <w:autoSpaceDN w:val="0"/>
+        <w:adjustRightInd w:val="0"/>
+        <w:spacing w:after="0" w:line="240" w:lineRule="auto"/>
+        <w:rPr>
+          <w:rFonts w:ascii="Times New Roman" w:hAnsi="Times New Roman" w:cs="Times New Roman"/>
+          <w:kern w:val="0"/>
+          <w:sz w:val="22"/>
+          <w:szCs w:val="22"/>
+        </w:rPr>
+      </w:pPr>
+      <w:r>
+        <w:rPr>
+          <w:rFonts w:ascii="Times New Roman" w:hAnsi="Times New Roman" w:cs="Times New Roman"/>
+          <w:kern w:val="0"/>
+          <w:sz w:val="22"/>
+          <w:szCs w:val="22"/>
+        </w:rPr>
+        <w:t>easing: the absolute magnitude of the negative part of the shock.</w:t>
+      </w:r>
+    </w:p>
+    <w:p>
+      <w:pPr>
+        <w:autoSpaceDE w:val="0"/>
+        <w:autoSpaceDN w:val="0"/>
+        <w:adjustRightInd w:val="0"/>
+        <w:spacing w:after="0" w:line="240" w:lineRule="auto"/>
+        <w:rPr>
+          <w:rFonts w:ascii="Times New Roman" w:hAnsi="Times New Roman" w:cs="Times New Roman"/>
+          <w:kern w:val="0"/>
+          <w:sz w:val="22"/>
+          <w:szCs w:val="22"/>
+        </w:rPr>
+      </w:pPr>
+      <w:proofErr w:type="gramStart"/>
+      <w:r>
+        <w:rPr>
+          <w:rFonts w:ascii="Times New Roman" w:hAnsi="Times New Roman" w:cs="Times New Roman"/>
+          <w:kern w:val="0"/>
+          <w:sz w:val="22"/>
+          <w:szCs w:val="22"/>
+        </w:rPr>
+        <w:t>So</w:t>
+      </w:r>
+      <w:proofErr w:type="gramEnd"/>
+      <w:r>
+        <w:rPr>
+          <w:rFonts w:ascii="Times New Roman" w:hAnsi="Times New Roman" w:cs="Times New Roman"/>
+          <w:kern w:val="0"/>
+          <w:sz w:val="22"/>
+          <w:szCs w:val="22"/>
+        </w:rPr>
+        <w:t xml:space="preserve"> both variables enter the regressions as positive magnitudes. This means the coefficients can now be interpreted directly</w:t>
+      </w:r>
+    </w:p>
+    <w:p>
+      <w:pPr>
+        <w:autoSpaceDE w:val="0"/>
+        <w:autoSpaceDN w:val="0"/>
+        <w:adjustRightInd w:val="0"/>
+        <w:spacing w:after="0" w:line="240" w:lineRule="auto"/>
+        <w:rPr>
+          <w:rFonts w:ascii="Times New Roman" w:hAnsi="Times New Roman" w:cs="Times New Roman"/>
+          <w:kern w:val="0"/>
+          <w:sz w:val="22"/>
+          <w:szCs w:val="22"/>
+        </w:rPr>
+      </w:pPr>
+    </w:p>
+    <w:p>
+      <w:pPr>
+        <w:autoSpaceDE w:val="0"/>
+        <w:autoSpaceDN w:val="0"/>
+        <w:adjustRightInd w:val="0"/>
+        <w:spacing w:after="0" w:line="240" w:lineRule="auto"/>
+        <w:rPr>
+          <w:rFonts w:ascii="Times New Roman" w:hAnsi="Times New Roman" w:cs="Times New Roman"/>
+          <w:kern w:val="0"/>
+          <w:sz w:val="22"/>
+          <w:szCs w:val="22"/>
+        </w:rPr>
+      </w:pPr>
+      <w:r>
+        <w:rPr>
+          <w:rFonts w:ascii="Times New Roman" w:hAnsi="Times New Roman" w:cs="Times New Roman"/>
+          <w:kern w:val="0"/>
+          <w:sz w:val="22"/>
+          <w:szCs w:val="22"/>
+        </w:rPr>
+        <w:t>C</w:t>
+      </w:r>
+      <w:r>
+        <w:rPr>
+          <w:rFonts w:ascii="Times New Roman" w:hAnsi="Times New Roman" w:cs="Times New Roman"/>
+          <w:kern w:val="0"/>
+          <w:sz w:val="22"/>
+          <w:szCs w:val="22"/>
+        </w:rPr>
+        <w:t xml:space="preserve">hanged easing shocks from being stored as negative numbers to being stored as positive magnitudes, so a shock of -0.25 now enters the regression as an easing shock of 0.25. This makes the easing coefficient and plot line directly interpretable as the estimated equity response to an easing surprise, without having </w:t>
+      </w:r>
+      <w:r>
+        <w:rPr>
+          <w:rFonts w:ascii="Times New Roman" w:hAnsi="Times New Roman" w:cs="Times New Roman"/>
+          <w:kern w:val="0"/>
+          <w:sz w:val="22"/>
+          <w:szCs w:val="22"/>
+        </w:rPr>
+        <w:t>to flip the sign manually.</w:t>
+      </w:r>
+    </w:p>
+    <w:p>
+      <w:pPr>
+        <w:autoSpaceDE w:val="0"/>
+        <w:autoSpaceDN w:val="0"/>
+        <w:adjustRightInd w:val="0"/>
+        <w:spacing w:after="0" w:line="240" w:lineRule="auto"/>
+        <w:rPr>
+          <w:rFonts w:ascii="Times New Roman" w:hAnsi="Times New Roman" w:cs="Times New Roman"/>
+          <w:kern w:val="0"/>
+          <w:sz w:val="22"/>
+          <w:szCs w:val="22"/>
+        </w:rPr>
+      </w:pPr>
+      <w:r>
+        <w:rPr>
+          <w:rFonts w:ascii="Times New Roman" w:hAnsi="Times New Roman" w:cs="Times New Roman"/>
+          <w:kern w:val="0"/>
+          <w:sz w:val="22"/>
+          <w:szCs w:val="22"/>
+        </w:rPr>
+        <w:t>Before, easing shocks were kept as negative-valued variables, so the plotted easing coefficient was the slope on a negative shock measure rather than the direct response to an easing shock magnitude.</w:t>
+      </w:r>
+    </w:p>
+    <w:p>
+      <w:pPr>
+        <w:autoSpaceDE w:val="0"/>
+        <w:autoSpaceDN w:val="0"/>
+        <w:adjustRightInd w:val="0"/>
+        <w:spacing w:after="0" w:line="240" w:lineRule="auto"/>
+        <w:rPr>
+          <w:rFonts w:ascii="Times New Roman" w:hAnsi="Times New Roman" w:cs="Times New Roman"/>
+          <w:kern w:val="0"/>
+          <w:sz w:val="22"/>
+          <w:szCs w:val="22"/>
+        </w:rPr>
+      </w:pPr>
+    </w:p>
+    <w:p>
+      <w:pPr>
+        <w:pStyle w:val="ListParagraph"/>
+        <w:numPr>
+          <w:ilvl w:val="0"/>
+          <w:numId w:val="34"/>
+        </w:numPr>
+        <w:autoSpaceDE w:val="0"/>
+        <w:autoSpaceDN w:val="0"/>
+        <w:adjustRightInd w:val="0"/>
+        <w:spacing w:after="0" w:line="240" w:lineRule="auto"/>
+        <w:rPr>
+          <w:rFonts w:ascii="Times New Roman" w:hAnsi="Times New Roman" w:cs="Times New Roman"/>
+          <w:kern w:val="0"/>
+          <w:sz w:val="22"/>
+          <w:szCs w:val="22"/>
+        </w:rPr>
+      </w:pPr>
+      <w:r>
+        <w:rPr>
+          <w:rFonts w:ascii="Times New Roman" w:hAnsi="Times New Roman" w:cs="Times New Roman"/>
+          <w:kern w:val="0"/>
+          <w:sz w:val="22"/>
+          <w:szCs w:val="22"/>
+        </w:rPr>
+        <w:t>Target shocks matter most.</w:t>
+      </w:r>
+    </w:p>
+    <w:p>
+      <w:pPr>
+        <w:pStyle w:val="ListParagraph"/>
+        <w:numPr>
+          <w:ilvl w:val="0"/>
+          <w:numId w:val="34"/>
+        </w:numPr>
+        <w:autoSpaceDE w:val="0"/>
+        <w:autoSpaceDN w:val="0"/>
+        <w:adjustRightInd w:val="0"/>
+        <w:spacing w:after="0" w:line="240" w:lineRule="auto"/>
+        <w:rPr>
+          <w:rFonts w:ascii="Times New Roman" w:hAnsi="Times New Roman" w:cs="Times New Roman"/>
+          <w:kern w:val="0"/>
+          <w:sz w:val="22"/>
+          <w:szCs w:val="22"/>
+        </w:rPr>
+      </w:pPr>
+      <w:r>
+        <w:rPr>
+          <w:rFonts w:ascii="Times New Roman" w:hAnsi="Times New Roman" w:cs="Times New Roman"/>
+          <w:kern w:val="0"/>
+          <w:sz w:val="22"/>
+          <w:szCs w:val="22"/>
+        </w:rPr>
+        <w:t xml:space="preserve">Uk </w:t>
+      </w:r>
+      <w:r>
+        <w:rPr>
+          <w:rFonts w:ascii="Times New Roman" w:hAnsi="Times New Roman" w:cs="Times New Roman"/>
+          <w:kern w:val="0"/>
+          <w:sz w:val="22"/>
+          <w:szCs w:val="22"/>
+        </w:rPr>
+        <w:t xml:space="preserve">equities tend to react negatively to unexpected changes in </w:t>
+      </w:r>
+      <w:r>
+        <w:rPr>
+          <w:rFonts w:ascii="Times New Roman" w:hAnsi="Times New Roman" w:cs="Times New Roman"/>
+          <w:kern w:val="0"/>
+          <w:sz w:val="22"/>
+          <w:szCs w:val="22"/>
+        </w:rPr>
+        <w:t>BoE</w:t>
+      </w:r>
+      <w:r>
+        <w:rPr>
+          <w:rFonts w:ascii="Times New Roman" w:hAnsi="Times New Roman" w:cs="Times New Roman"/>
+          <w:kern w:val="0"/>
+          <w:sz w:val="22"/>
+          <w:szCs w:val="22"/>
+        </w:rPr>
+        <w:t xml:space="preserve"> target-rate component, regardless of </w:t>
+      </w:r>
+      <w:r>
+        <w:rPr>
+          <w:rFonts w:ascii="Times New Roman" w:hAnsi="Times New Roman" w:cs="Times New Roman"/>
+          <w:kern w:val="0"/>
+          <w:sz w:val="22"/>
+          <w:szCs w:val="22"/>
+        </w:rPr>
+        <w:t>whether the surprise is tightening or easing</w:t>
+      </w:r>
+      <w:r>
+        <w:rPr>
+          <w:rFonts w:ascii="Times New Roman" w:hAnsi="Times New Roman" w:cs="Times New Roman"/>
+          <w:kern w:val="0"/>
+          <w:sz w:val="22"/>
+          <w:szCs w:val="22"/>
+        </w:rPr>
+        <w:t>.</w:t>
+      </w:r>
+    </w:p>
+    <w:p>
+      <w:pPr>
+        <w:pStyle w:val="ListParagraph"/>
+        <w:numPr>
+          <w:ilvl w:val="0"/>
+          <w:numId w:val="34"/>
+        </w:numPr>
+        <w:autoSpaceDE w:val="0"/>
+        <w:autoSpaceDN w:val="0"/>
+        <w:adjustRightInd w:val="0"/>
+        <w:spacing w:after="0" w:line="240" w:lineRule="auto"/>
+        <w:rPr>
+          <w:rFonts w:ascii="Times New Roman" w:hAnsi="Times New Roman" w:cs="Times New Roman"/>
+          <w:kern w:val="0"/>
+          <w:sz w:val="22"/>
+          <w:szCs w:val="22"/>
+        </w:rPr>
+      </w:pPr>
+      <w:r>
+        <w:rPr>
+          <w:rFonts w:ascii="Times New Roman" w:hAnsi="Times New Roman" w:cs="Times New Roman"/>
+          <w:kern w:val="0"/>
+          <w:sz w:val="22"/>
+          <w:szCs w:val="22"/>
+        </w:rPr>
+        <w:t xml:space="preserve">Easing surprises may be interpreted by equity markets as bad news about economic conditions, so the information effect may dominate the discount-rate effect – information effects are </w:t>
+      </w:r>
+      <w:r>
+        <w:rPr>
+          <w:rFonts w:ascii="Times New Roman" w:hAnsi="Times New Roman" w:cs="Times New Roman"/>
+          <w:kern w:val="0"/>
+          <w:sz w:val="22"/>
+          <w:szCs w:val="22"/>
+        </w:rPr>
+        <w:t>important</w:t>
+      </w:r>
+      <w:r>
+        <w:rPr>
+          <w:rFonts w:ascii="Times New Roman" w:hAnsi="Times New Roman" w:cs="Times New Roman"/>
+          <w:kern w:val="0"/>
+          <w:sz w:val="22"/>
+          <w:szCs w:val="22"/>
+        </w:rPr>
+        <w:t>.</w:t>
+      </w:r>
+    </w:p>
+    <w:p>
+      <w:pPr>
+        <w:pStyle w:val="ListParagraph"/>
+        <w:numPr>
+          <w:ilvl w:val="0"/>
+          <w:numId w:val="34"/>
+        </w:numPr>
+        <w:autoSpaceDE w:val="0"/>
+        <w:autoSpaceDN w:val="0"/>
+        <w:adjustRightInd w:val="0"/>
+        <w:spacing w:after="0" w:line="240" w:lineRule="auto"/>
+        <w:rPr>
+          <w:rFonts w:ascii="Times New Roman" w:hAnsi="Times New Roman" w:cs="Times New Roman"/>
+          <w:kern w:val="0"/>
+          <w:sz w:val="22"/>
+          <w:szCs w:val="22"/>
+        </w:rPr>
+      </w:pPr>
+      <w:r>
+        <w:rPr>
+          <w:rFonts w:ascii="Times New Roman" w:hAnsi="Times New Roman" w:cs="Times New Roman"/>
+          <w:kern w:val="0"/>
+          <w:sz w:val="22"/>
+          <w:szCs w:val="22"/>
+        </w:rPr>
+        <w:t xml:space="preserve">QE surprises do not generate a clear immediate equity </w:t>
+      </w:r>
+      <w:proofErr w:type="gramStart"/>
+      <w:r>
+        <w:rPr>
+          <w:rFonts w:ascii="Times New Roman" w:hAnsi="Times New Roman" w:cs="Times New Roman"/>
+          <w:kern w:val="0"/>
+          <w:sz w:val="22"/>
+          <w:szCs w:val="22"/>
+        </w:rPr>
+        <w:t>response</w:t>
+      </w:r>
+      <w:proofErr w:type="gramEnd"/>
+      <w:r>
+        <w:rPr>
+          <w:rFonts w:ascii="Times New Roman" w:hAnsi="Times New Roman" w:cs="Times New Roman"/>
+          <w:kern w:val="0"/>
+          <w:sz w:val="22"/>
+          <w:szCs w:val="22"/>
+        </w:rPr>
+        <w:t xml:space="preserve"> but</w:t>
+      </w:r>
+      <w:r>
+        <w:rPr>
+          <w:rFonts w:ascii="Times New Roman" w:hAnsi="Times New Roman" w:cs="Times New Roman"/>
+          <w:kern w:val="0"/>
+          <w:sz w:val="22"/>
+          <w:szCs w:val="22"/>
+        </w:rPr>
+        <w:t xml:space="preserve"> easing-type QE shocks are associated with positive longer-horizon cumulative returns.</w:t>
+      </w:r>
+    </w:p>
+    <w:p>
+      <w:pPr>
+        <w:pStyle w:val="ListParagraph"/>
+        <w:numPr>
+          <w:ilvl w:val="0"/>
+          <w:numId w:val="34"/>
+        </w:numPr>
+        <w:autoSpaceDE w:val="0"/>
+        <w:autoSpaceDN w:val="0"/>
+        <w:adjustRightInd w:val="0"/>
+        <w:spacing w:after="0" w:line="240" w:lineRule="auto"/>
+        <w:rPr>
+          <w:rFonts w:ascii="Times New Roman" w:hAnsi="Times New Roman" w:cs="Times New Roman"/>
+          <w:kern w:val="0"/>
+          <w:sz w:val="22"/>
+          <w:szCs w:val="22"/>
+        </w:rPr>
+      </w:pPr>
+      <w:r>
+        <w:rPr>
+          <w:rFonts w:ascii="Times New Roman" w:hAnsi="Times New Roman" w:cs="Times New Roman"/>
+          <w:kern w:val="0"/>
+          <w:sz w:val="22"/>
+          <w:szCs w:val="22"/>
+        </w:rPr>
+        <w:t>Path shocks are less robust in the basic specifications.</w:t>
+      </w:r>
+    </w:p>
+    <w:p>
+      <w:pPr>
+        <w:pStyle w:val="ListParagraph"/>
+        <w:numPr>
+          <w:ilvl w:val="0"/>
+          <w:numId w:val="34"/>
+        </w:numPr>
+        <w:autoSpaceDE w:val="0"/>
+        <w:autoSpaceDN w:val="0"/>
+        <w:adjustRightInd w:val="0"/>
+        <w:spacing w:after="0" w:line="240" w:lineRule="auto"/>
+        <w:rPr>
+          <w:rFonts w:ascii="Times New Roman" w:hAnsi="Times New Roman" w:cs="Times New Roman"/>
+          <w:kern w:val="0"/>
+          <w:sz w:val="22"/>
+          <w:szCs w:val="22"/>
+        </w:rPr>
+      </w:pPr>
+      <w:r>
+        <w:rPr>
+          <w:rFonts w:ascii="Times New Roman" w:hAnsi="Times New Roman" w:cs="Times New Roman"/>
+          <w:kern w:val="0"/>
+          <w:sz w:val="22"/>
+          <w:szCs w:val="22"/>
+        </w:rPr>
+        <w:t>Adding FTSE 100 and FTSE All-Share return controls weakens some immediate estimated responses of the FTSE 250. This suggests that part of the immediate FTSE 250 reaction reflects broad UK equity-market co</w:t>
+      </w:r>
+      <w:r>
+        <w:rPr>
+          <w:rFonts w:ascii="Times New Roman" w:hAnsi="Times New Roman" w:cs="Times New Roman"/>
+          <w:kern w:val="0"/>
+          <w:sz w:val="22"/>
+          <w:szCs w:val="22"/>
+        </w:rPr>
+        <w:t>-</w:t>
+      </w:r>
+      <w:r>
+        <w:rPr>
+          <w:rFonts w:ascii="Times New Roman" w:hAnsi="Times New Roman" w:cs="Times New Roman"/>
+          <w:kern w:val="0"/>
+          <w:sz w:val="22"/>
+          <w:szCs w:val="22"/>
+        </w:rPr>
+        <w:t>movement rather than a purely FTSE 250-specific monetary-policy response.</w:t>
+      </w:r>
+    </w:p>
+    <w:p>
+      <w:pPr>
+        <w:pStyle w:val="ListParagraph"/>
+        <w:numPr>
+          <w:ilvl w:val="0"/>
+          <w:numId w:val="34"/>
+        </w:numPr>
+        <w:autoSpaceDE w:val="0"/>
+        <w:autoSpaceDN w:val="0"/>
+        <w:adjustRightInd w:val="0"/>
+        <w:spacing w:after="0" w:line="240" w:lineRule="auto"/>
+        <w:rPr>
+          <w:rFonts w:ascii="Times New Roman" w:hAnsi="Times New Roman" w:cs="Times New Roman"/>
+          <w:kern w:val="0"/>
+          <w:sz w:val="22"/>
+          <w:szCs w:val="22"/>
+        </w:rPr>
+      </w:pPr>
+      <w:r>
+        <w:rPr>
+          <w:rFonts w:ascii="Times New Roman" w:hAnsi="Times New Roman" w:cs="Times New Roman"/>
+          <w:kern w:val="0"/>
+          <w:sz w:val="22"/>
+          <w:szCs w:val="22"/>
+        </w:rPr>
+        <w:t>Regime-interaction estimates suggest substantial state dependence, especially around COVID and QT, but these results should be interpreted cautiously given the shorter regime-specific samples.</w:t>
+      </w:r>
+    </w:p>
+    <w:p>
+      <w:pPr>
+        <w:autoSpaceDE w:val="0"/>
+        <w:autoSpaceDN w:val="0"/>
+        <w:adjustRightInd w:val="0"/>
+        <w:spacing w:after="0" w:line="240" w:lineRule="auto"/>
+        <w:rPr>
+          <w:rFonts w:ascii="Times New Roman" w:hAnsi="Times New Roman" w:cs="Times New Roman"/>
+          <w:kern w:val="0"/>
+          <w:sz w:val="22"/>
+          <w:szCs w:val="22"/>
+        </w:rPr>
+      </w:pPr>
+    </w:p>
+    <w:p>
+      <w:pPr>
+        <w:autoSpaceDE w:val="0"/>
+        <w:autoSpaceDN w:val="0"/>
+        <w:adjustRightInd w:val="0"/>
+        <w:spacing w:after="0" w:line="240" w:lineRule="auto"/>
+        <w:rPr>
+          <w:rFonts w:ascii="Times New Roman" w:hAnsi="Times New Roman" w:cs="Times New Roman"/>
+          <w:kern w:val="0"/>
+          <w:sz w:val="22"/>
+          <w:szCs w:val="22"/>
+        </w:rPr>
+      </w:pPr>
+    </w:p>
+    <w:p>
+      <w:pPr>
+        <w:autoSpaceDE w:val="0"/>
+        <w:autoSpaceDN w:val="0"/>
+        <w:adjustRightInd w:val="0"/>
+        <w:spacing w:after="0" w:line="240" w:lineRule="auto"/>
+        <w:rPr>
+          <w:rFonts w:ascii="Times New Roman" w:hAnsi="Times New Roman" w:cs="Times New Roman"/>
+          <w:b/>
+          <w:bCs/>
+          <w:kern w:val="0"/>
+        </w:rPr>
+      </w:pPr>
+    </w:p>
+    <w:p>
+      <w:pPr>
+        <w:autoSpaceDE w:val="0"/>
+        <w:autoSpaceDN w:val="0"/>
+        <w:adjustRightInd w:val="0"/>
+        <w:spacing w:after="0" w:line="240" w:lineRule="auto"/>
+        <w:rPr>
+          <w:rFonts w:ascii="Times New Roman" w:hAnsi="Times New Roman" w:cs="Times New Roman"/>
+          <w:b/>
+          <w:bCs/>
+          <w:kern w:val="0"/>
+        </w:rPr>
+      </w:pPr>
+    </w:p>
+    <w:p>
+      <w:pPr>
+        <w:autoSpaceDE w:val="0"/>
+        <w:autoSpaceDN w:val="0"/>
+        <w:adjustRightInd w:val="0"/>
+        <w:spacing w:after="0" w:line="240" w:lineRule="auto"/>
+        <w:rPr>
+          <w:rFonts w:ascii="Times New Roman" w:eastAsia="MS Gothic" w:hAnsi="Times New Roman" w:cs="Times New Roman"/>
+          <w:kern w:val="0"/>
+        </w:rPr>
+      </w:pPr>
+      <w:r>
+        <w:rPr>
+          <w:rFonts w:ascii="Times New Roman" w:hAnsi="Times New Roman" w:cs="Times New Roman"/>
+          <w:b/>
+          <w:bCs/>
+          <w:kern w:val="0"/>
+        </w:rPr>
+        <w:t>Main Plot Interpretation</w:t>
+      </w:r>
+    </w:p>
+    <w:p>
+      <w:pPr>
+        <w:autoSpaceDE w:val="0"/>
+        <w:autoSpaceDN w:val="0"/>
+        <w:adjustRightInd w:val="0"/>
+        <w:spacing w:after="0" w:line="240" w:lineRule="auto"/>
+        <w:rPr>
+          <w:rFonts w:ascii="Times New Roman" w:hAnsi="Times New Roman" w:cs="Times New Roman"/>
+          <w:kern w:val="0"/>
+        </w:rPr>
+      </w:pPr>
+      <w:r>
+        <w:rPr>
+          <w:rFonts w:ascii="Times New Roman" w:hAnsi="Times New Roman" w:cs="Times New Roman"/>
+          <w:kern w:val="0"/>
+        </w:rPr>
+        <w:t>Your most important current plots are the v4 FTSE 250 plots in output_v4/figures.</w:t>
+      </w:r>
+    </w:p>
+    <w:p>
+      <w:pPr>
+        <w:autoSpaceDE w:val="0"/>
+        <w:autoSpaceDN w:val="0"/>
+        <w:adjustRightInd w:val="0"/>
+        <w:spacing w:after="0" w:line="240" w:lineRule="auto"/>
+        <w:rPr>
+          <w:rFonts w:ascii="Times New Roman" w:hAnsi="Times New Roman" w:cs="Times New Roman"/>
+          <w:kern w:val="0"/>
+        </w:rPr>
+      </w:pPr>
+    </w:p>
+    <w:p>
+      <w:pPr>
+        <w:autoSpaceDE w:val="0"/>
+        <w:autoSpaceDN w:val="0"/>
+        <w:adjustRightInd w:val="0"/>
+        <w:spacing w:after="0" w:line="240" w:lineRule="auto"/>
+        <w:rPr>
+          <w:rFonts w:ascii="Times New Roman" w:hAnsi="Times New Roman" w:cs="Times New Roman"/>
+          <w:kern w:val="0"/>
+        </w:rPr>
+      </w:pPr>
+      <w:r>
+        <w:rPr>
+          <w:rFonts w:ascii="Times New Roman" w:hAnsi="Times New Roman" w:cs="Times New Roman"/>
+          <w:kern w:val="0"/>
+        </w:rPr>
+        <w:t xml:space="preserve">The strongest headline is from robustness_target_full_v4.png. Target tightening has the expected negative sign: positive target-rate surprises lower FTSE 250 returns. In the baseline, the horizon-0 coefficient is about -0.048, significant with p = 0.003. A one-standard-deviation target tightening gives roughly -0.054% on impact, and around -0.16% by horizon 10. Target easing is not behaving like a simple mirror image: the raw easing coefficient is positive at many horizons, meaning an actual negative target shock often also implies a negative return response. This is </w:t>
+      </w:r>
+      <w:r>
+        <w:rPr>
+          <w:rFonts w:ascii="Times New Roman" w:hAnsi="Times New Roman" w:cs="Times New Roman"/>
+          <w:kern w:val="0"/>
+        </w:rPr>
+        <w:lastRenderedPageBreak/>
+        <w:t>why your asymmetry p-values are low for target shocks. That is an important result, but also one you should be cautious about interpreting.</w:t>
+      </w:r>
+    </w:p>
+    <w:p>
+      <w:pPr>
+        <w:autoSpaceDE w:val="0"/>
+        <w:autoSpaceDN w:val="0"/>
+        <w:adjustRightInd w:val="0"/>
+        <w:spacing w:after="0" w:line="240" w:lineRule="auto"/>
+        <w:rPr>
+          <w:rFonts w:ascii="Times New Roman" w:hAnsi="Times New Roman" w:cs="Times New Roman"/>
+          <w:kern w:val="0"/>
+        </w:rPr>
+      </w:pPr>
+    </w:p>
+    <w:p>
+      <w:pPr>
+        <w:autoSpaceDE w:val="0"/>
+        <w:autoSpaceDN w:val="0"/>
+        <w:adjustRightInd w:val="0"/>
+        <w:spacing w:after="0" w:line="240" w:lineRule="auto"/>
+        <w:rPr>
+          <w:rFonts w:ascii="Times New Roman" w:hAnsi="Times New Roman" w:cs="Times New Roman"/>
+          <w:kern w:val="0"/>
+        </w:rPr>
+      </w:pPr>
+      <w:r>
+        <w:rPr>
+          <w:rFonts w:ascii="Times New Roman" w:hAnsi="Times New Roman" w:cs="Times New Roman"/>
+          <w:kern w:val="0"/>
+        </w:rPr>
+        <w:t>robustness_path_full_v4.png is weaker. Path tightening is mixed and mostly imprecise. Path easing raw coefficients are often negative, meaning actual easing tends to raise returns, but the full-sample evidence is not very strong. In the magnitude table, one-standard-deviation path easing is positive but small, roughly +0.10% by horizon 20.</w:t>
+      </w:r>
+    </w:p>
+    <w:p>
+      <w:pPr>
+        <w:autoSpaceDE w:val="0"/>
+        <w:autoSpaceDN w:val="0"/>
+        <w:adjustRightInd w:val="0"/>
+        <w:spacing w:after="0" w:line="240" w:lineRule="auto"/>
+        <w:rPr>
+          <w:rFonts w:ascii="Times New Roman" w:hAnsi="Times New Roman" w:cs="Times New Roman"/>
+          <w:kern w:val="0"/>
+        </w:rPr>
+      </w:pPr>
+    </w:p>
+    <w:p>
+      <w:pPr>
+        <w:autoSpaceDE w:val="0"/>
+        <w:autoSpaceDN w:val="0"/>
+        <w:adjustRightInd w:val="0"/>
+        <w:spacing w:after="0" w:line="240" w:lineRule="auto"/>
+        <w:rPr>
+          <w:rFonts w:ascii="Times New Roman" w:hAnsi="Times New Roman" w:cs="Times New Roman"/>
+          <w:kern w:val="0"/>
+        </w:rPr>
+      </w:pPr>
+      <w:r>
+        <w:rPr>
+          <w:rFonts w:ascii="Times New Roman" w:hAnsi="Times New Roman" w:cs="Times New Roman"/>
+          <w:kern w:val="0"/>
+        </w:rPr>
+        <w:t>robustness_qe_full_v4.png is interesting at longer horizons. QE tightening is close to zero early and becomes mildly positive later, but uncertainty is wide. QE easing has negative raw coefficients, so actual QE easing implies positive equity responses. At horizon 20, the baseline raw easing coefficient is about -0.451, significant at p = 0.031, implying a one-standard-deviation easing response of about +0.37%. This is probably your cleanest “QE easing supports equities” type result, but it appears later and with wide bands.</w:t>
+      </w:r>
+    </w:p>
+    <w:p>
+      <w:pPr>
+        <w:autoSpaceDE w:val="0"/>
+        <w:autoSpaceDN w:val="0"/>
+        <w:adjustRightInd w:val="0"/>
+        <w:spacing w:after="0" w:line="240" w:lineRule="auto"/>
+        <w:rPr>
+          <w:rFonts w:ascii="Times New Roman" w:hAnsi="Times New Roman" w:cs="Times New Roman"/>
+          <w:kern w:val="0"/>
+        </w:rPr>
+      </w:pPr>
+    </w:p>
+    <w:p>
+      <w:pPr>
+        <w:autoSpaceDE w:val="0"/>
+        <w:autoSpaceDN w:val="0"/>
+        <w:adjustRightInd w:val="0"/>
+        <w:spacing w:after="0" w:line="240" w:lineRule="auto"/>
+        <w:rPr>
+          <w:rFonts w:ascii="Times New Roman" w:hAnsi="Times New Roman" w:cs="Times New Roman"/>
+          <w:kern w:val="0"/>
+        </w:rPr>
+      </w:pPr>
+      <w:r>
+        <w:rPr>
+          <w:rFonts w:ascii="Times New Roman" w:hAnsi="Times New Roman" w:cs="Times New Roman"/>
+          <w:kern w:val="0"/>
+        </w:rPr>
+        <w:t xml:space="preserve">Subsample plots suggest the effects may be </w:t>
+      </w:r>
+      <w:proofErr w:type="gramStart"/>
+      <w:r>
+        <w:rPr>
+          <w:rFonts w:ascii="Times New Roman" w:hAnsi="Times New Roman" w:cs="Times New Roman"/>
+          <w:kern w:val="0"/>
+        </w:rPr>
+        <w:t>regime-dependent</w:t>
+      </w:r>
+      <w:proofErr w:type="gramEnd"/>
+      <w:r>
+        <w:rPr>
+          <w:rFonts w:ascii="Times New Roman" w:hAnsi="Times New Roman" w:cs="Times New Roman"/>
+          <w:kern w:val="0"/>
+        </w:rPr>
+        <w:t>. Target effects are stronger post-QE / COVID-onward than pre-QE. QE results are naturally post-2009 dominated. The v4 regime-interaction plots are visually dramatic, especially for COVID and QT periods, but I would present them as exploratory because the confidence intervals are wide and the post-2020 / post-2022 samples are short.</w:t>
+      </w:r>
+    </w:p>
+    <w:p>
+      <w:pPr>
+        <w:autoSpaceDE w:val="0"/>
+        <w:autoSpaceDN w:val="0"/>
+        <w:adjustRightInd w:val="0"/>
+        <w:spacing w:after="0" w:line="240" w:lineRule="auto"/>
+        <w:rPr>
+          <w:rFonts w:ascii="Times New Roman" w:hAnsi="Times New Roman" w:cs="Times New Roman"/>
+          <w:kern w:val="0"/>
+        </w:rPr>
+      </w:pPr>
+    </w:p>
+    <w:p>
+      <w:pPr>
+        <w:autoSpaceDE w:val="0"/>
+        <w:autoSpaceDN w:val="0"/>
+        <w:adjustRightInd w:val="0"/>
+        <w:spacing w:after="0" w:line="240" w:lineRule="auto"/>
+        <w:rPr>
+          <w:rFonts w:ascii="Times New Roman" w:eastAsia="MS Gothic" w:hAnsi="Times New Roman" w:cs="Times New Roman"/>
+          <w:kern w:val="0"/>
+        </w:rPr>
+      </w:pPr>
+      <w:r>
+        <w:rPr>
+          <w:rFonts w:ascii="Times New Roman" w:hAnsi="Times New Roman" w:cs="Times New Roman"/>
+          <w:b/>
+          <w:bCs/>
+          <w:kern w:val="0"/>
+        </w:rPr>
+        <w:t>Evolution From v1 To v4</w:t>
+      </w:r>
+    </w:p>
+    <w:p>
+      <w:pPr>
+        <w:autoSpaceDE w:val="0"/>
+        <w:autoSpaceDN w:val="0"/>
+        <w:adjustRightInd w:val="0"/>
+        <w:spacing w:after="0" w:line="240" w:lineRule="auto"/>
+        <w:rPr>
+          <w:rFonts w:ascii="Times New Roman" w:hAnsi="Times New Roman" w:cs="Times New Roman"/>
+          <w:kern w:val="0"/>
+        </w:rPr>
+      </w:pPr>
+      <w:r>
+        <w:rPr>
+          <w:rFonts w:ascii="Times New Roman" w:hAnsi="Times New Roman" w:cs="Times New Roman"/>
+          <w:kern w:val="0"/>
+        </w:rPr>
+        <w:t>v1: simple baseline. FTSE 100 only, three separate local projections for target/path/QE, positive and negative shock components, 5 return lags, HAC standard errors.</w:t>
+      </w:r>
+    </w:p>
+    <w:p>
+      <w:pPr>
+        <w:autoSpaceDE w:val="0"/>
+        <w:autoSpaceDN w:val="0"/>
+        <w:adjustRightInd w:val="0"/>
+        <w:spacing w:after="0" w:line="240" w:lineRule="auto"/>
+        <w:rPr>
+          <w:rFonts w:ascii="Times New Roman" w:hAnsi="Times New Roman" w:cs="Times New Roman"/>
+          <w:kern w:val="0"/>
+        </w:rPr>
+      </w:pPr>
+      <w:r>
+        <w:rPr>
+          <w:rFonts w:ascii="Times New Roman" w:hAnsi="Times New Roman" w:cs="Times New Roman"/>
+          <w:kern w:val="0"/>
+        </w:rPr>
+        <w:t>v2: broadened the analysis. Added FTSE 100, FTSE 250, FTSE All-Share; added joint versus single-shock specifications; added pre/post-QE and pre/post-Super Thursday splits; produced many comparison plots.</w:t>
+      </w:r>
+    </w:p>
+    <w:p>
+      <w:pPr>
+        <w:autoSpaceDE w:val="0"/>
+        <w:autoSpaceDN w:val="0"/>
+        <w:adjustRightInd w:val="0"/>
+        <w:spacing w:after="0" w:line="240" w:lineRule="auto"/>
+        <w:rPr>
+          <w:rFonts w:ascii="Times New Roman" w:hAnsi="Times New Roman" w:cs="Times New Roman"/>
+          <w:kern w:val="0"/>
+        </w:rPr>
+      </w:pPr>
+      <w:r>
+        <w:rPr>
+          <w:rFonts w:ascii="Times New Roman" w:hAnsi="Times New Roman" w:cs="Times New Roman"/>
+          <w:kern w:val="0"/>
+        </w:rPr>
+        <w:t>v3: narrowed the main object to FTSE 250. Added robustness specifications: 10 lags, FTSE 100 controls, All-Share controls, and dual controls. This made the project more focused and less like a plot factory.</w:t>
+      </w:r>
+    </w:p>
+    <w:p>
+      <w:pPr>
+        <w:autoSpaceDE w:val="0"/>
+        <w:autoSpaceDN w:val="0"/>
+        <w:adjustRightInd w:val="0"/>
+        <w:spacing w:after="0" w:line="240" w:lineRule="auto"/>
+        <w:rPr>
+          <w:rFonts w:ascii="Times New Roman" w:hAnsi="Times New Roman" w:cs="Times New Roman"/>
+          <w:kern w:val="0"/>
+        </w:rPr>
+      </w:pPr>
+      <w:r>
+        <w:rPr>
+          <w:rFonts w:ascii="Times New Roman" w:hAnsi="Times New Roman" w:cs="Times New Roman"/>
+          <w:kern w:val="0"/>
+        </w:rPr>
+        <w:t>v4: added formal regime interactions. Instead of only splitting samples, you estimate whether responses differ after QE, after Super Thursday, during COVID onward, and QT onward. This is the most advanced version, but also the one needing the most careful interpretation.</w:t>
+      </w:r>
+    </w:p>
+    <w:p>
+      <w:pPr>
+        <w:autoSpaceDE w:val="0"/>
+        <w:autoSpaceDN w:val="0"/>
+        <w:adjustRightInd w:val="0"/>
+        <w:spacing w:after="0" w:line="240" w:lineRule="auto"/>
+        <w:rPr>
+          <w:rFonts w:ascii="Times New Roman" w:hAnsi="Times New Roman" w:cs="Times New Roman"/>
+          <w:b/>
+          <w:bCs/>
+          <w:kern w:val="0"/>
+        </w:rPr>
+      </w:pPr>
+    </w:p>
+    <w:p>
+      <w:pPr>
+        <w:autoSpaceDE w:val="0"/>
+        <w:autoSpaceDN w:val="0"/>
+        <w:adjustRightInd w:val="0"/>
+        <w:spacing w:after="0" w:line="240" w:lineRule="auto"/>
+        <w:rPr>
+          <w:rFonts w:ascii="Times New Roman" w:eastAsia="MS Gothic" w:hAnsi="Times New Roman" w:cs="Times New Roman"/>
+          <w:kern w:val="0"/>
+        </w:rPr>
+      </w:pPr>
+      <w:r>
+        <w:rPr>
+          <w:rFonts w:ascii="Times New Roman" w:hAnsi="Times New Roman" w:cs="Times New Roman"/>
+          <w:b/>
+          <w:bCs/>
+          <w:kern w:val="0"/>
+        </w:rPr>
+        <w:t>Should You Look At VIX?</w:t>
+      </w:r>
+    </w:p>
+    <w:p>
+      <w:pPr>
+        <w:autoSpaceDE w:val="0"/>
+        <w:autoSpaceDN w:val="0"/>
+        <w:adjustRightInd w:val="0"/>
+        <w:spacing w:after="0" w:line="240" w:lineRule="auto"/>
+        <w:rPr>
+          <w:rFonts w:ascii="Times New Roman" w:hAnsi="Times New Roman" w:cs="Times New Roman"/>
+          <w:kern w:val="0"/>
+        </w:rPr>
+      </w:pPr>
+      <w:r>
+        <w:rPr>
+          <w:rFonts w:ascii="Times New Roman" w:hAnsi="Times New Roman" w:cs="Times New Roman"/>
+          <w:kern w:val="0"/>
+        </w:rPr>
+        <w:t>Yes, but frame it carefully. VIX is US equity-market volatility, so it is not a perfect UK uncertainty measure. It could still be useful as a global risk-sentiment control, especially because monetary-policy event days may coincide with broader risk-on/risk-off moves.</w:t>
+      </w:r>
+    </w:p>
+    <w:p>
+      <w:pPr>
+        <w:autoSpaceDE w:val="0"/>
+        <w:autoSpaceDN w:val="0"/>
+        <w:adjustRightInd w:val="0"/>
+        <w:spacing w:after="0" w:line="240" w:lineRule="auto"/>
+        <w:rPr>
+          <w:rFonts w:ascii="Times New Roman" w:hAnsi="Times New Roman" w:cs="Times New Roman"/>
+          <w:kern w:val="0"/>
+        </w:rPr>
+      </w:pPr>
+      <w:r>
+        <w:rPr>
+          <w:rFonts w:ascii="Times New Roman" w:hAnsi="Times New Roman" w:cs="Times New Roman"/>
+          <w:kern w:val="0"/>
+        </w:rPr>
+        <w:t>Better options to ask about:</w:t>
+      </w:r>
+    </w:p>
+    <w:p>
+      <w:pPr>
+        <w:pStyle w:val="ListParagraph"/>
+        <w:numPr>
+          <w:ilvl w:val="0"/>
+          <w:numId w:val="20"/>
+        </w:numPr>
+        <w:autoSpaceDE w:val="0"/>
+        <w:autoSpaceDN w:val="0"/>
+        <w:adjustRightInd w:val="0"/>
+        <w:spacing w:after="0" w:line="240" w:lineRule="auto"/>
+        <w:rPr>
+          <w:rFonts w:ascii="Times New Roman" w:hAnsi="Times New Roman" w:cs="Times New Roman"/>
+          <w:kern w:val="0"/>
+        </w:rPr>
+      </w:pPr>
+      <w:r>
+        <w:rPr>
+          <w:rFonts w:ascii="Times New Roman" w:hAnsi="Times New Roman" w:cs="Times New Roman"/>
+          <w:kern w:val="0"/>
+        </w:rPr>
+        <w:t>Use VIX as a global risk control.</w:t>
+      </w:r>
+    </w:p>
+    <w:p>
+      <w:pPr>
+        <w:pStyle w:val="ListParagraph"/>
+        <w:numPr>
+          <w:ilvl w:val="0"/>
+          <w:numId w:val="20"/>
+        </w:numPr>
+        <w:autoSpaceDE w:val="0"/>
+        <w:autoSpaceDN w:val="0"/>
+        <w:adjustRightInd w:val="0"/>
+        <w:spacing w:after="0" w:line="240" w:lineRule="auto"/>
+        <w:rPr>
+          <w:rFonts w:ascii="Times New Roman" w:hAnsi="Times New Roman" w:cs="Times New Roman"/>
+          <w:kern w:val="0"/>
+        </w:rPr>
+      </w:pPr>
+      <w:r>
+        <w:rPr>
+          <w:rFonts w:ascii="Times New Roman" w:hAnsi="Times New Roman" w:cs="Times New Roman"/>
+          <w:kern w:val="0"/>
+        </w:rPr>
+        <w:t>Use FTSE implied volatility if available, e.g. VFTSE, as a UK-specific alternative.</w:t>
+      </w:r>
+    </w:p>
+    <w:p>
+      <w:pPr>
+        <w:pStyle w:val="ListParagraph"/>
+        <w:numPr>
+          <w:ilvl w:val="0"/>
+          <w:numId w:val="20"/>
+        </w:numPr>
+        <w:autoSpaceDE w:val="0"/>
+        <w:autoSpaceDN w:val="0"/>
+        <w:adjustRightInd w:val="0"/>
+        <w:spacing w:after="0" w:line="240" w:lineRule="auto"/>
+        <w:rPr>
+          <w:rFonts w:ascii="Times New Roman" w:hAnsi="Times New Roman" w:cs="Times New Roman"/>
+          <w:kern w:val="0"/>
+        </w:rPr>
+      </w:pPr>
+      <w:r>
+        <w:rPr>
+          <w:rFonts w:ascii="Times New Roman" w:hAnsi="Times New Roman" w:cs="Times New Roman"/>
+          <w:kern w:val="0"/>
+        </w:rPr>
+        <w:t>Add daily change in VIX rather than level, since returns may react to volatility surprises.</w:t>
+      </w:r>
+    </w:p>
+    <w:p>
+      <w:pPr>
+        <w:pStyle w:val="ListParagraph"/>
+        <w:numPr>
+          <w:ilvl w:val="0"/>
+          <w:numId w:val="20"/>
+        </w:numPr>
+        <w:autoSpaceDE w:val="0"/>
+        <w:autoSpaceDN w:val="0"/>
+        <w:adjustRightInd w:val="0"/>
+        <w:spacing w:after="0" w:line="240" w:lineRule="auto"/>
+        <w:rPr>
+          <w:rFonts w:ascii="Times New Roman" w:hAnsi="Times New Roman" w:cs="Times New Roman"/>
+          <w:kern w:val="0"/>
+        </w:rPr>
+      </w:pPr>
+      <w:r>
+        <w:rPr>
+          <w:rFonts w:ascii="Times New Roman" w:hAnsi="Times New Roman" w:cs="Times New Roman"/>
+          <w:kern w:val="0"/>
+        </w:rPr>
+        <w:t>Check whether adding VIX weakens the QE/COVID/QT effects, which may partly reflect crisis risk premia rather than pure monetary-policy transmission.</w:t>
+      </w:r>
+    </w:p>
+    <w:p>
+      <w:pPr>
+        <w:autoSpaceDE w:val="0"/>
+        <w:autoSpaceDN w:val="0"/>
+        <w:adjustRightInd w:val="0"/>
+        <w:spacing w:after="0" w:line="240" w:lineRule="auto"/>
+        <w:rPr>
+          <w:rFonts w:ascii="Times New Roman" w:hAnsi="Times New Roman" w:cs="Times New Roman"/>
+          <w:b/>
+          <w:bCs/>
+          <w:kern w:val="0"/>
+        </w:rPr>
+      </w:pPr>
+    </w:p>
+    <w:p>
+      <w:pPr>
+        <w:autoSpaceDE w:val="0"/>
+        <w:autoSpaceDN w:val="0"/>
+        <w:adjustRightInd w:val="0"/>
+        <w:spacing w:after="0" w:line="240" w:lineRule="auto"/>
+        <w:rPr>
+          <w:rFonts w:ascii="Times New Roman" w:eastAsia="MS Gothic" w:hAnsi="Times New Roman" w:cs="Times New Roman"/>
+          <w:kern w:val="0"/>
+        </w:rPr>
+      </w:pPr>
+      <w:r>
+        <w:rPr>
+          <w:rFonts w:ascii="Times New Roman" w:hAnsi="Times New Roman" w:cs="Times New Roman"/>
+          <w:b/>
+          <w:bCs/>
+          <w:kern w:val="0"/>
+        </w:rPr>
+        <w:t>Questions For Your Advisor</w:t>
+      </w:r>
+    </w:p>
+    <w:p>
+      <w:pPr>
+        <w:autoSpaceDE w:val="0"/>
+        <w:autoSpaceDN w:val="0"/>
+        <w:adjustRightInd w:val="0"/>
+        <w:spacing w:after="0" w:line="240" w:lineRule="auto"/>
+        <w:rPr>
+          <w:rFonts w:ascii="Times New Roman" w:hAnsi="Times New Roman" w:cs="Times New Roman"/>
+          <w:kern w:val="0"/>
+        </w:rPr>
+      </w:pPr>
+      <w:r>
+        <w:rPr>
+          <w:rFonts w:ascii="Times New Roman" w:hAnsi="Times New Roman" w:cs="Times New Roman"/>
+          <w:kern w:val="0"/>
+        </w:rPr>
+        <w:lastRenderedPageBreak/>
+        <w:t>Ask whether FTSE 250 should remain the headline index. It has a nice UK-domestic interpretation, but FTSE 100 is more internationally exposed and may respond differently through exchange rates.</w:t>
+      </w:r>
+    </w:p>
+    <w:p>
+      <w:pPr>
+        <w:autoSpaceDE w:val="0"/>
+        <w:autoSpaceDN w:val="0"/>
+        <w:adjustRightInd w:val="0"/>
+        <w:spacing w:after="0" w:line="240" w:lineRule="auto"/>
+        <w:rPr>
+          <w:rFonts w:ascii="Times New Roman" w:hAnsi="Times New Roman" w:cs="Times New Roman"/>
+          <w:kern w:val="0"/>
+        </w:rPr>
+      </w:pPr>
+    </w:p>
+    <w:p>
+      <w:pPr>
+        <w:autoSpaceDE w:val="0"/>
+        <w:autoSpaceDN w:val="0"/>
+        <w:adjustRightInd w:val="0"/>
+        <w:spacing w:after="0" w:line="240" w:lineRule="auto"/>
+        <w:rPr>
+          <w:rFonts w:ascii="Times New Roman" w:hAnsi="Times New Roman" w:cs="Times New Roman"/>
+          <w:kern w:val="0"/>
+        </w:rPr>
+      </w:pPr>
+      <w:r>
+        <w:rPr>
+          <w:rFonts w:ascii="Times New Roman" w:hAnsi="Times New Roman" w:cs="Times New Roman"/>
+          <w:kern w:val="0"/>
+        </w:rPr>
+        <w:t>Ask how to scale shocks in the write-up. Raw coefficients are hard to interpret because the shock units are not intuitive. Your one-standard-deviation response table is better for presentation.</w:t>
+      </w:r>
+    </w:p>
+    <w:p>
+      <w:pPr>
+        <w:autoSpaceDE w:val="0"/>
+        <w:autoSpaceDN w:val="0"/>
+        <w:adjustRightInd w:val="0"/>
+        <w:spacing w:after="0" w:line="240" w:lineRule="auto"/>
+        <w:rPr>
+          <w:rFonts w:ascii="Times New Roman" w:hAnsi="Times New Roman" w:cs="Times New Roman"/>
+          <w:kern w:val="0"/>
+        </w:rPr>
+      </w:pPr>
+    </w:p>
+    <w:p>
+      <w:pPr>
+        <w:autoSpaceDE w:val="0"/>
+        <w:autoSpaceDN w:val="0"/>
+        <w:adjustRightInd w:val="0"/>
+        <w:spacing w:after="0" w:line="240" w:lineRule="auto"/>
+        <w:rPr>
+          <w:rFonts w:ascii="Times New Roman" w:hAnsi="Times New Roman" w:cs="Times New Roman"/>
+          <w:kern w:val="0"/>
+        </w:rPr>
+      </w:pPr>
+      <w:r>
+        <w:rPr>
+          <w:rFonts w:ascii="Times New Roman" w:hAnsi="Times New Roman" w:cs="Times New Roman"/>
+          <w:kern w:val="0"/>
+        </w:rPr>
+        <w:t>Ask whether the easing/tightening split is theoretically justified or whether a symmetric shock specification should be the baseline and asymmetry should be secondary.</w:t>
+      </w:r>
+    </w:p>
+    <w:p>
+      <w:pPr>
+        <w:autoSpaceDE w:val="0"/>
+        <w:autoSpaceDN w:val="0"/>
+        <w:adjustRightInd w:val="0"/>
+        <w:spacing w:after="0" w:line="240" w:lineRule="auto"/>
+        <w:rPr>
+          <w:rFonts w:ascii="Times New Roman" w:hAnsi="Times New Roman" w:cs="Times New Roman"/>
+          <w:kern w:val="0"/>
+        </w:rPr>
+      </w:pPr>
+    </w:p>
+    <w:p>
+      <w:pPr>
+        <w:autoSpaceDE w:val="0"/>
+        <w:autoSpaceDN w:val="0"/>
+        <w:adjustRightInd w:val="0"/>
+        <w:spacing w:after="0" w:line="240" w:lineRule="auto"/>
+        <w:rPr>
+          <w:rFonts w:ascii="Times New Roman" w:hAnsi="Times New Roman" w:cs="Times New Roman"/>
+          <w:kern w:val="0"/>
+        </w:rPr>
+      </w:pPr>
+      <w:r>
+        <w:rPr>
+          <w:rFonts w:ascii="Times New Roman" w:hAnsi="Times New Roman" w:cs="Times New Roman"/>
+          <w:kern w:val="0"/>
+        </w:rPr>
+        <w:t>Ask whether QE should be estimated only post-2009 by construction. You currently replace QE rows with post-QE estimates, which is sensible, but this needs to be stated clearly.</w:t>
+      </w:r>
+    </w:p>
+    <w:p>
+      <w:pPr>
+        <w:autoSpaceDE w:val="0"/>
+        <w:autoSpaceDN w:val="0"/>
+        <w:adjustRightInd w:val="0"/>
+        <w:spacing w:after="0" w:line="240" w:lineRule="auto"/>
+        <w:rPr>
+          <w:rFonts w:ascii="Times New Roman" w:hAnsi="Times New Roman" w:cs="Times New Roman"/>
+          <w:kern w:val="0"/>
+        </w:rPr>
+      </w:pPr>
+    </w:p>
+    <w:p>
+      <w:pPr>
+        <w:autoSpaceDE w:val="0"/>
+        <w:autoSpaceDN w:val="0"/>
+        <w:adjustRightInd w:val="0"/>
+        <w:spacing w:after="0" w:line="240" w:lineRule="auto"/>
+        <w:rPr>
+          <w:rFonts w:ascii="Times New Roman" w:hAnsi="Times New Roman" w:cs="Times New Roman"/>
+          <w:kern w:val="0"/>
+        </w:rPr>
+      </w:pPr>
+      <w:r>
+        <w:rPr>
+          <w:rFonts w:ascii="Times New Roman" w:hAnsi="Times New Roman" w:cs="Times New Roman"/>
+          <w:kern w:val="0"/>
+        </w:rPr>
+        <w:t>Ask whether regime interactions are too ambitious for the sample size. They are interesting, but COVID/QT results may be fragile.</w:t>
+      </w:r>
+    </w:p>
+    <w:p>
+      <w:pPr>
+        <w:autoSpaceDE w:val="0"/>
+        <w:autoSpaceDN w:val="0"/>
+        <w:adjustRightInd w:val="0"/>
+        <w:spacing w:after="0" w:line="240" w:lineRule="auto"/>
+        <w:rPr>
+          <w:rFonts w:ascii="Times New Roman" w:hAnsi="Times New Roman" w:cs="Times New Roman"/>
+          <w:kern w:val="0"/>
+        </w:rPr>
+      </w:pPr>
+    </w:p>
+    <w:p>
+      <w:pPr>
+        <w:autoSpaceDE w:val="0"/>
+        <w:autoSpaceDN w:val="0"/>
+        <w:adjustRightInd w:val="0"/>
+        <w:spacing w:after="0" w:line="240" w:lineRule="auto"/>
+        <w:rPr>
+          <w:rFonts w:ascii="Times New Roman" w:hAnsi="Times New Roman" w:cs="Times New Roman"/>
+          <w:kern w:val="0"/>
+        </w:rPr>
+      </w:pPr>
+      <w:r>
+        <w:rPr>
+          <w:rFonts w:ascii="Times New Roman" w:hAnsi="Times New Roman" w:cs="Times New Roman"/>
+          <w:kern w:val="0"/>
+        </w:rPr>
+        <w:t>Ask whether to add controls: VIX/change in VIX, exchange rates, gilt yields, or global equity returns.</w:t>
+      </w:r>
+    </w:p>
+    <w:p>
+      <w:pPr>
+        <w:autoSpaceDE w:val="0"/>
+        <w:autoSpaceDN w:val="0"/>
+        <w:adjustRightInd w:val="0"/>
+        <w:spacing w:after="0" w:line="240" w:lineRule="auto"/>
+        <w:rPr>
+          <w:rFonts w:ascii="Times New Roman" w:hAnsi="Times New Roman" w:cs="Times New Roman"/>
+          <w:b/>
+          <w:bCs/>
+          <w:kern w:val="0"/>
+        </w:rPr>
+      </w:pPr>
+    </w:p>
+    <w:p>
+      <w:pPr>
+        <w:autoSpaceDE w:val="0"/>
+        <w:autoSpaceDN w:val="0"/>
+        <w:adjustRightInd w:val="0"/>
+        <w:spacing w:after="0" w:line="240" w:lineRule="auto"/>
+        <w:rPr>
+          <w:rFonts w:ascii="Times New Roman" w:hAnsi="Times New Roman" w:cs="Times New Roman"/>
+          <w:b/>
+          <w:bCs/>
+          <w:kern w:val="0"/>
+        </w:rPr>
+      </w:pPr>
+    </w:p>
+    <w:p>
+      <w:pPr>
+        <w:autoSpaceDE w:val="0"/>
+        <w:autoSpaceDN w:val="0"/>
+        <w:adjustRightInd w:val="0"/>
+        <w:spacing w:after="0" w:line="240" w:lineRule="auto"/>
+        <w:rPr>
+          <w:rFonts w:ascii="Times New Roman" w:hAnsi="Times New Roman" w:cs="Times New Roman"/>
+          <w:b/>
+          <w:bCs/>
+          <w:kern w:val="0"/>
+        </w:rPr>
+      </w:pPr>
+    </w:p>
+    <w:p>
+      <w:pPr>
+        <w:autoSpaceDE w:val="0"/>
+        <w:autoSpaceDN w:val="0"/>
+        <w:adjustRightInd w:val="0"/>
+        <w:spacing w:after="0" w:line="240" w:lineRule="auto"/>
+        <w:rPr>
+          <w:rFonts w:ascii="Times New Roman" w:hAnsi="Times New Roman" w:cs="Times New Roman"/>
+          <w:kern w:val="0"/>
+        </w:rPr>
+      </w:pPr>
+      <w:r>
+        <w:rPr>
+          <w:rFonts w:ascii="Times New Roman" w:hAnsi="Times New Roman" w:cs="Times New Roman"/>
+          <w:b/>
+          <w:bCs/>
+          <w:kern w:val="0"/>
+        </w:rPr>
+        <w:t>Core Direction</w:t>
+      </w:r>
+    </w:p>
+    <w:p>
+      <w:pPr>
+        <w:autoSpaceDE w:val="0"/>
+        <w:autoSpaceDN w:val="0"/>
+        <w:adjustRightInd w:val="0"/>
+        <w:spacing w:after="0" w:line="240" w:lineRule="auto"/>
+        <w:rPr>
+          <w:rFonts w:ascii="Times New Roman" w:hAnsi="Times New Roman" w:cs="Times New Roman"/>
+          <w:kern w:val="0"/>
+        </w:rPr>
+      </w:pPr>
+      <w:r>
+        <w:rPr>
+          <w:rFonts w:ascii="Times New Roman" w:hAnsi="Times New Roman" w:cs="Times New Roman"/>
+          <w:kern w:val="0"/>
+        </w:rPr>
+        <w:t>1. S</w:t>
+      </w:r>
+      <w:r>
+        <w:rPr>
+          <w:rFonts w:ascii="Times New Roman" w:hAnsi="Times New Roman" w:cs="Times New Roman"/>
+          <w:kern w:val="0"/>
+        </w:rPr>
+        <w:t>hould I keep FTSE 250 as the main dependent variable, or should the project still compare FTSE 100, FTSE 250, and FTSE All-Share?</w:t>
+      </w:r>
+    </w:p>
+    <w:p>
+      <w:pPr>
+        <w:autoSpaceDE w:val="0"/>
+        <w:autoSpaceDN w:val="0"/>
+        <w:adjustRightInd w:val="0"/>
+        <w:spacing w:after="0" w:line="240" w:lineRule="auto"/>
+        <w:rPr>
+          <w:rFonts w:ascii="Times New Roman" w:hAnsi="Times New Roman" w:cs="Times New Roman"/>
+          <w:kern w:val="0"/>
+        </w:rPr>
+      </w:pPr>
+      <w:r>
+        <w:rPr>
+          <w:rFonts w:ascii="Times New Roman" w:hAnsi="Times New Roman" w:cs="Times New Roman"/>
+          <w:kern w:val="0"/>
+        </w:rPr>
+        <w:t xml:space="preserve">2. </w:t>
+      </w:r>
+      <w:r>
+        <w:rPr>
+          <w:rFonts w:ascii="Times New Roman" w:hAnsi="Times New Roman" w:cs="Times New Roman"/>
+          <w:kern w:val="0"/>
+        </w:rPr>
+        <w:t>Is the current focus too broad: target/path/QE shocks, asymmetry, subsamples, robustness, and regimes? Which one should become the main contribution?</w:t>
+      </w:r>
+    </w:p>
+    <w:p>
+      <w:pPr>
+        <w:autoSpaceDE w:val="0"/>
+        <w:autoSpaceDN w:val="0"/>
+        <w:adjustRightInd w:val="0"/>
+        <w:spacing w:after="0" w:line="240" w:lineRule="auto"/>
+        <w:rPr>
+          <w:rFonts w:ascii="Times New Roman" w:hAnsi="Times New Roman" w:cs="Times New Roman"/>
+          <w:kern w:val="0"/>
+        </w:rPr>
+      </w:pPr>
+      <w:r>
+        <w:rPr>
+          <w:rFonts w:ascii="Times New Roman" w:hAnsi="Times New Roman" w:cs="Times New Roman"/>
+          <w:kern w:val="0"/>
+        </w:rPr>
+        <w:t xml:space="preserve">3. </w:t>
+      </w:r>
+      <w:r>
+        <w:rPr>
+          <w:rFonts w:ascii="Times New Roman" w:hAnsi="Times New Roman" w:cs="Times New Roman"/>
+          <w:kern w:val="0"/>
+        </w:rPr>
+        <w:t>Should my final project emphasize the asymmetry result, especially for target shocks, or treat it as a secondary finding?</w:t>
+      </w:r>
+    </w:p>
+    <w:p>
+      <w:pPr>
+        <w:autoSpaceDE w:val="0"/>
+        <w:autoSpaceDN w:val="0"/>
+        <w:adjustRightInd w:val="0"/>
+        <w:spacing w:after="0" w:line="240" w:lineRule="auto"/>
+        <w:rPr>
+          <w:rFonts w:ascii="Times New Roman" w:hAnsi="Times New Roman" w:cs="Times New Roman"/>
+          <w:b/>
+          <w:bCs/>
+          <w:kern w:val="0"/>
+        </w:rPr>
+      </w:pPr>
+    </w:p>
+    <w:p>
+      <w:pPr>
+        <w:autoSpaceDE w:val="0"/>
+        <w:autoSpaceDN w:val="0"/>
+        <w:adjustRightInd w:val="0"/>
+        <w:spacing w:after="0" w:line="240" w:lineRule="auto"/>
+        <w:rPr>
+          <w:rFonts w:ascii="Times New Roman" w:eastAsia="MS Gothic" w:hAnsi="Times New Roman" w:cs="Times New Roman"/>
+          <w:kern w:val="0"/>
+        </w:rPr>
+      </w:pPr>
+      <w:r>
+        <w:rPr>
+          <w:rFonts w:ascii="Times New Roman" w:hAnsi="Times New Roman" w:cs="Times New Roman"/>
+          <w:b/>
+          <w:bCs/>
+          <w:kern w:val="0"/>
+        </w:rPr>
+        <w:t>Specification Choices</w:t>
+      </w:r>
+    </w:p>
+    <w:p>
+      <w:pPr>
+        <w:autoSpaceDE w:val="0"/>
+        <w:autoSpaceDN w:val="0"/>
+        <w:adjustRightInd w:val="0"/>
+        <w:spacing w:after="0" w:line="240" w:lineRule="auto"/>
+        <w:rPr>
+          <w:rFonts w:ascii="Times New Roman" w:eastAsia="MS Gothic" w:hAnsi="Times New Roman" w:cs="Times New Roman"/>
+          <w:kern w:val="0"/>
+        </w:rPr>
+      </w:pPr>
+      <w:r>
+        <w:rPr>
+          <w:rFonts w:ascii="Times New Roman" w:hAnsi="Times New Roman" w:cs="Times New Roman"/>
+          <w:kern w:val="0"/>
+        </w:rPr>
+        <w:t>4. Should the baseline be the joint specification with target, path, and QE together, or separate single-shock regressions?</w:t>
+      </w:r>
+    </w:p>
+    <w:p>
+      <w:pPr>
+        <w:autoSpaceDE w:val="0"/>
+        <w:autoSpaceDN w:val="0"/>
+        <w:adjustRightInd w:val="0"/>
+        <w:spacing w:after="0" w:line="240" w:lineRule="auto"/>
+        <w:rPr>
+          <w:rFonts w:ascii="Times New Roman" w:eastAsia="MS Gothic" w:hAnsi="Times New Roman" w:cs="Times New Roman"/>
+          <w:kern w:val="0"/>
+        </w:rPr>
+      </w:pPr>
+      <w:r>
+        <w:rPr>
+          <w:rFonts w:ascii="Times New Roman" w:hAnsi="Times New Roman" w:cs="Times New Roman"/>
+          <w:kern w:val="0"/>
+        </w:rPr>
+        <w:t>5. Is splitting shocks into positive and negative components defensible, or should I first estimate a symmetric baseline and then test asymmetry?</w:t>
+      </w:r>
+    </w:p>
+    <w:p>
+      <w:pPr>
+        <w:autoSpaceDE w:val="0"/>
+        <w:autoSpaceDN w:val="0"/>
+        <w:adjustRightInd w:val="0"/>
+        <w:spacing w:after="0" w:line="240" w:lineRule="auto"/>
+        <w:rPr>
+          <w:rFonts w:ascii="Times New Roman" w:eastAsia="MS Gothic" w:hAnsi="Times New Roman" w:cs="Times New Roman"/>
+          <w:kern w:val="0"/>
+        </w:rPr>
+      </w:pPr>
+      <w:r>
+        <w:rPr>
+          <w:rFonts w:ascii="Times New Roman" w:hAnsi="Times New Roman" w:cs="Times New Roman"/>
+          <w:kern w:val="0"/>
+        </w:rPr>
+        <w:t>6. Are 5 lags of daily returns enough, or should I justify the 10-lag robustness more formally?</w:t>
+      </w:r>
+    </w:p>
+    <w:p>
+      <w:pPr>
+        <w:autoSpaceDE w:val="0"/>
+        <w:autoSpaceDN w:val="0"/>
+        <w:adjustRightInd w:val="0"/>
+        <w:spacing w:after="0" w:line="240" w:lineRule="auto"/>
+        <w:rPr>
+          <w:rFonts w:ascii="Times New Roman" w:hAnsi="Times New Roman" w:cs="Times New Roman"/>
+          <w:kern w:val="0"/>
+        </w:rPr>
+      </w:pPr>
+      <w:r>
+        <w:rPr>
+          <w:rFonts w:ascii="Times New Roman" w:hAnsi="Times New Roman" w:cs="Times New Roman"/>
+          <w:kern w:val="0"/>
+        </w:rPr>
+        <w:t>7. Should I include contemporaneous controls like FTSE 100 / All-Share returns, or is that bad because they may absorb the same monetary shock channel I am trying to estimate?</w:t>
+      </w:r>
+    </w:p>
+    <w:p>
+      <w:pPr>
+        <w:autoSpaceDE w:val="0"/>
+        <w:autoSpaceDN w:val="0"/>
+        <w:adjustRightInd w:val="0"/>
+        <w:spacing w:after="0" w:line="240" w:lineRule="auto"/>
+        <w:rPr>
+          <w:rFonts w:ascii="Times New Roman" w:hAnsi="Times New Roman" w:cs="Times New Roman"/>
+          <w:b/>
+          <w:bCs/>
+          <w:kern w:val="0"/>
+        </w:rPr>
+      </w:pPr>
+    </w:p>
+    <w:p>
+      <w:pPr>
+        <w:autoSpaceDE w:val="0"/>
+        <w:autoSpaceDN w:val="0"/>
+        <w:adjustRightInd w:val="0"/>
+        <w:spacing w:after="0" w:line="240" w:lineRule="auto"/>
+        <w:rPr>
+          <w:rFonts w:ascii="Times New Roman" w:eastAsia="MS Gothic" w:hAnsi="Times New Roman" w:cs="Times New Roman"/>
+          <w:kern w:val="0"/>
+        </w:rPr>
+      </w:pPr>
+      <w:r>
+        <w:rPr>
+          <w:rFonts w:ascii="Times New Roman" w:hAnsi="Times New Roman" w:cs="Times New Roman"/>
+          <w:b/>
+          <w:bCs/>
+          <w:kern w:val="0"/>
+        </w:rPr>
+        <w:t>QE And Regimes</w:t>
+      </w:r>
+    </w:p>
+    <w:p>
+      <w:pPr>
+        <w:autoSpaceDE w:val="0"/>
+        <w:autoSpaceDN w:val="0"/>
+        <w:adjustRightInd w:val="0"/>
+        <w:spacing w:after="0" w:line="240" w:lineRule="auto"/>
+        <w:rPr>
+          <w:rFonts w:ascii="Times New Roman" w:eastAsia="MS Gothic" w:hAnsi="Times New Roman" w:cs="Times New Roman"/>
+          <w:kern w:val="0"/>
+        </w:rPr>
+      </w:pPr>
+      <w:r>
+        <w:rPr>
+          <w:rFonts w:ascii="Times New Roman" w:hAnsi="Times New Roman" w:cs="Times New Roman"/>
+          <w:kern w:val="0"/>
+        </w:rPr>
+        <w:t>8. Should QE shocks only be estimated post-2009, as I currently do, or is there a better way to handle the pre-QE period?</w:t>
+      </w:r>
+    </w:p>
+    <w:p>
+      <w:pPr>
+        <w:autoSpaceDE w:val="0"/>
+        <w:autoSpaceDN w:val="0"/>
+        <w:adjustRightInd w:val="0"/>
+        <w:spacing w:after="0" w:line="240" w:lineRule="auto"/>
+        <w:rPr>
+          <w:rFonts w:ascii="Times New Roman" w:eastAsia="MS Gothic" w:hAnsi="Times New Roman" w:cs="Times New Roman"/>
+          <w:kern w:val="0"/>
+        </w:rPr>
+      </w:pPr>
+      <w:r>
+        <w:rPr>
+          <w:rFonts w:ascii="Times New Roman" w:hAnsi="Times New Roman" w:cs="Times New Roman"/>
+          <w:kern w:val="0"/>
+        </w:rPr>
+        <w:t>9. Are my regime splits economically sensible: QE start, Super Thursday, COVID, QT? Or should I simplify to one or two splits?</w:t>
+      </w:r>
+    </w:p>
+    <w:p>
+      <w:pPr>
+        <w:autoSpaceDE w:val="0"/>
+        <w:autoSpaceDN w:val="0"/>
+        <w:adjustRightInd w:val="0"/>
+        <w:spacing w:after="0" w:line="240" w:lineRule="auto"/>
+        <w:rPr>
+          <w:rFonts w:ascii="Times New Roman" w:hAnsi="Times New Roman" w:cs="Times New Roman"/>
+          <w:kern w:val="0"/>
+        </w:rPr>
+      </w:pPr>
+      <w:r>
+        <w:rPr>
+          <w:rFonts w:ascii="Times New Roman" w:hAnsi="Times New Roman" w:cs="Times New Roman"/>
+          <w:kern w:val="0"/>
+        </w:rPr>
+        <w:t>10. Are the v4 regime-interaction results too noisy for the sample size? Should I keep them as exploratory or remove them from the main results?</w:t>
+      </w:r>
+    </w:p>
+    <w:p>
+      <w:pPr>
+        <w:autoSpaceDE w:val="0"/>
+        <w:autoSpaceDN w:val="0"/>
+        <w:adjustRightInd w:val="0"/>
+        <w:spacing w:after="0" w:line="240" w:lineRule="auto"/>
+        <w:rPr>
+          <w:rFonts w:ascii="Times New Roman" w:hAnsi="Times New Roman" w:cs="Times New Roman"/>
+          <w:b/>
+          <w:bCs/>
+          <w:kern w:val="0"/>
+        </w:rPr>
+      </w:pPr>
+    </w:p>
+    <w:p>
+      <w:pPr>
+        <w:autoSpaceDE w:val="0"/>
+        <w:autoSpaceDN w:val="0"/>
+        <w:adjustRightInd w:val="0"/>
+        <w:spacing w:after="0" w:line="240" w:lineRule="auto"/>
+        <w:rPr>
+          <w:rFonts w:ascii="Times New Roman" w:eastAsia="MS Gothic" w:hAnsi="Times New Roman" w:cs="Times New Roman"/>
+          <w:kern w:val="0"/>
+        </w:rPr>
+      </w:pPr>
+      <w:r>
+        <w:rPr>
+          <w:rFonts w:ascii="Times New Roman" w:hAnsi="Times New Roman" w:cs="Times New Roman"/>
+          <w:b/>
+          <w:bCs/>
+          <w:kern w:val="0"/>
+        </w:rPr>
+        <w:lastRenderedPageBreak/>
+        <w:t>Interpretation</w:t>
+      </w:r>
+    </w:p>
+    <w:p>
+      <w:pPr>
+        <w:autoSpaceDE w:val="0"/>
+        <w:autoSpaceDN w:val="0"/>
+        <w:adjustRightInd w:val="0"/>
+        <w:spacing w:after="0" w:line="240" w:lineRule="auto"/>
+        <w:rPr>
+          <w:rFonts w:ascii="Times New Roman" w:eastAsia="MS Gothic" w:hAnsi="Times New Roman" w:cs="Times New Roman"/>
+          <w:kern w:val="0"/>
+        </w:rPr>
+      </w:pPr>
+      <w:r>
+        <w:rPr>
+          <w:rFonts w:ascii="Times New Roman" w:hAnsi="Times New Roman" w:cs="Times New Roman"/>
+          <w:kern w:val="0"/>
+        </w:rPr>
+        <w:t>11. For target shocks, tightening lowers returns as expected, but easing does not always raise returns. Is that an interesting asymmetry or a sign of misspecification?</w:t>
+      </w:r>
+    </w:p>
+    <w:p>
+      <w:pPr>
+        <w:autoSpaceDE w:val="0"/>
+        <w:autoSpaceDN w:val="0"/>
+        <w:adjustRightInd w:val="0"/>
+        <w:spacing w:after="0" w:line="240" w:lineRule="auto"/>
+        <w:rPr>
+          <w:rFonts w:ascii="Times New Roman" w:eastAsia="MS Gothic" w:hAnsi="Times New Roman" w:cs="Times New Roman"/>
+          <w:kern w:val="0"/>
+        </w:rPr>
+      </w:pPr>
+      <w:r>
+        <w:rPr>
+          <w:rFonts w:ascii="Times New Roman" w:hAnsi="Times New Roman" w:cs="Times New Roman"/>
+          <w:kern w:val="0"/>
+        </w:rPr>
+        <w:t>12. Should I interpret coefficients in raw shock units, or mainly use one-standard-deviation shock responses?</w:t>
+      </w:r>
+    </w:p>
+    <w:p>
+      <w:pPr>
+        <w:autoSpaceDE w:val="0"/>
+        <w:autoSpaceDN w:val="0"/>
+        <w:adjustRightInd w:val="0"/>
+        <w:spacing w:after="0" w:line="240" w:lineRule="auto"/>
+        <w:rPr>
+          <w:rFonts w:ascii="Times New Roman" w:eastAsia="MS Gothic" w:hAnsi="Times New Roman" w:cs="Times New Roman"/>
+          <w:kern w:val="0"/>
+        </w:rPr>
+      </w:pPr>
+      <w:r>
+        <w:rPr>
+          <w:rFonts w:ascii="Times New Roman" w:hAnsi="Times New Roman" w:cs="Times New Roman"/>
+          <w:kern w:val="0"/>
+        </w:rPr>
+        <w:t>13. Should I focus more on impact effects, short-run effects around 0-5 days, or cumulative responses up to 20 days?</w:t>
+      </w:r>
+    </w:p>
+    <w:p>
+      <w:pPr>
+        <w:autoSpaceDE w:val="0"/>
+        <w:autoSpaceDN w:val="0"/>
+        <w:adjustRightInd w:val="0"/>
+        <w:spacing w:after="0" w:line="240" w:lineRule="auto"/>
+        <w:rPr>
+          <w:rFonts w:ascii="Times New Roman" w:hAnsi="Times New Roman" w:cs="Times New Roman"/>
+          <w:kern w:val="0"/>
+        </w:rPr>
+      </w:pPr>
+      <w:r>
+        <w:rPr>
+          <w:rFonts w:ascii="Times New Roman" w:hAnsi="Times New Roman" w:cs="Times New Roman"/>
+          <w:kern w:val="0"/>
+        </w:rPr>
+        <w:t>14. Are the low R-squared values fine in this event-study/local-projection context, or do I need to address them explicitly?</w:t>
+      </w:r>
+    </w:p>
+    <w:p>
+      <w:pPr>
+        <w:autoSpaceDE w:val="0"/>
+        <w:autoSpaceDN w:val="0"/>
+        <w:adjustRightInd w:val="0"/>
+        <w:spacing w:after="0" w:line="240" w:lineRule="auto"/>
+        <w:rPr>
+          <w:rFonts w:ascii="Times New Roman" w:hAnsi="Times New Roman" w:cs="Times New Roman"/>
+          <w:b/>
+          <w:bCs/>
+          <w:kern w:val="0"/>
+        </w:rPr>
+      </w:pPr>
+    </w:p>
+    <w:p>
+      <w:pPr>
+        <w:autoSpaceDE w:val="0"/>
+        <w:autoSpaceDN w:val="0"/>
+        <w:adjustRightInd w:val="0"/>
+        <w:spacing w:after="0" w:line="240" w:lineRule="auto"/>
+        <w:rPr>
+          <w:rFonts w:ascii="Times New Roman" w:eastAsia="MS Gothic" w:hAnsi="Times New Roman" w:cs="Times New Roman"/>
+          <w:kern w:val="0"/>
+        </w:rPr>
+      </w:pPr>
+      <w:r>
+        <w:rPr>
+          <w:rFonts w:ascii="Times New Roman" w:hAnsi="Times New Roman" w:cs="Times New Roman"/>
+          <w:b/>
+          <w:bCs/>
+          <w:kern w:val="0"/>
+        </w:rPr>
+        <w:t>Robustness Improvements</w:t>
+      </w:r>
+    </w:p>
+    <w:p>
+      <w:pPr>
+        <w:autoSpaceDE w:val="0"/>
+        <w:autoSpaceDN w:val="0"/>
+        <w:adjustRightInd w:val="0"/>
+        <w:spacing w:after="0" w:line="240" w:lineRule="auto"/>
+        <w:rPr>
+          <w:rFonts w:ascii="Times New Roman" w:eastAsia="MS Gothic" w:hAnsi="Times New Roman" w:cs="Times New Roman"/>
+          <w:kern w:val="0"/>
+        </w:rPr>
+      </w:pPr>
+      <w:r>
+        <w:rPr>
+          <w:rFonts w:ascii="Times New Roman" w:hAnsi="Times New Roman" w:cs="Times New Roman"/>
+          <w:kern w:val="0"/>
+        </w:rPr>
+        <w:t>15. Should I add VIX or change in VIX as a global risk-sentiment control?</w:t>
+      </w:r>
+    </w:p>
+    <w:p>
+      <w:pPr>
+        <w:autoSpaceDE w:val="0"/>
+        <w:autoSpaceDN w:val="0"/>
+        <w:adjustRightInd w:val="0"/>
+        <w:spacing w:after="0" w:line="240" w:lineRule="auto"/>
+        <w:rPr>
+          <w:rFonts w:ascii="Times New Roman" w:eastAsia="MS Gothic" w:hAnsi="Times New Roman" w:cs="Times New Roman"/>
+          <w:kern w:val="0"/>
+        </w:rPr>
+      </w:pPr>
+      <w:r>
+        <w:rPr>
+          <w:rFonts w:ascii="Times New Roman" w:hAnsi="Times New Roman" w:cs="Times New Roman"/>
+          <w:kern w:val="0"/>
+        </w:rPr>
+        <w:t>16. Would a UK-specific volatility index, like VFTSE if available, be better than VIX?</w:t>
+      </w:r>
+    </w:p>
+    <w:p>
+      <w:pPr>
+        <w:autoSpaceDE w:val="0"/>
+        <w:autoSpaceDN w:val="0"/>
+        <w:adjustRightInd w:val="0"/>
+        <w:spacing w:after="0" w:line="240" w:lineRule="auto"/>
+        <w:rPr>
+          <w:rFonts w:ascii="Times New Roman" w:eastAsia="MS Gothic" w:hAnsi="Times New Roman" w:cs="Times New Roman"/>
+          <w:kern w:val="0"/>
+        </w:rPr>
+      </w:pPr>
+      <w:r>
+        <w:rPr>
+          <w:rFonts w:ascii="Times New Roman" w:hAnsi="Times New Roman" w:cs="Times New Roman"/>
+          <w:kern w:val="0"/>
+        </w:rPr>
+        <w:t>17. Should I control for exchange rates, especially GBP/USD or GBP/EUR, since UK equities may respond through currency channels?</w:t>
+      </w:r>
+    </w:p>
+    <w:p>
+      <w:pPr>
+        <w:autoSpaceDE w:val="0"/>
+        <w:autoSpaceDN w:val="0"/>
+        <w:adjustRightInd w:val="0"/>
+        <w:spacing w:after="0" w:line="240" w:lineRule="auto"/>
+        <w:rPr>
+          <w:rFonts w:ascii="Times New Roman" w:eastAsia="MS Gothic" w:hAnsi="Times New Roman" w:cs="Times New Roman"/>
+          <w:kern w:val="0"/>
+        </w:rPr>
+      </w:pPr>
+      <w:r>
+        <w:rPr>
+          <w:rFonts w:ascii="Times New Roman" w:hAnsi="Times New Roman" w:cs="Times New Roman"/>
+          <w:kern w:val="0"/>
+        </w:rPr>
+        <w:t>18. Should I control for gilt yields to separate equity responses from bond-market transmission?</w:t>
+      </w:r>
+    </w:p>
+    <w:p>
+      <w:pPr>
+        <w:autoSpaceDE w:val="0"/>
+        <w:autoSpaceDN w:val="0"/>
+        <w:adjustRightInd w:val="0"/>
+        <w:spacing w:after="0" w:line="240" w:lineRule="auto"/>
+        <w:rPr>
+          <w:rFonts w:ascii="Times New Roman" w:eastAsia="MS Gothic" w:hAnsi="Times New Roman" w:cs="Times New Roman"/>
+          <w:kern w:val="0"/>
+        </w:rPr>
+      </w:pPr>
+      <w:r>
+        <w:rPr>
+          <w:rFonts w:ascii="Times New Roman" w:hAnsi="Times New Roman" w:cs="Times New Roman"/>
+          <w:kern w:val="0"/>
+        </w:rPr>
+        <w:t>19. Should I exclude or separately analyse extreme periods like COVID, rather than include them in the full sample?</w:t>
+      </w:r>
+    </w:p>
+    <w:p>
+      <w:pPr>
+        <w:autoSpaceDE w:val="0"/>
+        <w:autoSpaceDN w:val="0"/>
+        <w:adjustRightInd w:val="0"/>
+        <w:spacing w:after="0" w:line="240" w:lineRule="auto"/>
+        <w:rPr>
+          <w:rFonts w:ascii="Times New Roman" w:hAnsi="Times New Roman" w:cs="Times New Roman"/>
+          <w:kern w:val="0"/>
+        </w:rPr>
+      </w:pPr>
+      <w:r>
+        <w:rPr>
+          <w:rFonts w:ascii="Times New Roman" w:hAnsi="Times New Roman" w:cs="Times New Roman"/>
+          <w:kern w:val="0"/>
+        </w:rPr>
+        <w:t>20. Should I winsorise extreme returns/shocks, or is it better to keep event-study outliers because they are economically meaningful?</w:t>
+      </w:r>
+    </w:p>
+    <w:p>
+      <w:pPr>
+        <w:autoSpaceDE w:val="0"/>
+        <w:autoSpaceDN w:val="0"/>
+        <w:adjustRightInd w:val="0"/>
+        <w:spacing w:after="0" w:line="240" w:lineRule="auto"/>
+        <w:rPr>
+          <w:rFonts w:ascii="Times New Roman" w:hAnsi="Times New Roman" w:cs="Times New Roman"/>
+          <w:b/>
+          <w:bCs/>
+          <w:kern w:val="0"/>
+        </w:rPr>
+      </w:pPr>
+    </w:p>
+    <w:p>
+      <w:pPr>
+        <w:autoSpaceDE w:val="0"/>
+        <w:autoSpaceDN w:val="0"/>
+        <w:adjustRightInd w:val="0"/>
+        <w:spacing w:after="0" w:line="240" w:lineRule="auto"/>
+        <w:rPr>
+          <w:rFonts w:ascii="Times New Roman" w:eastAsia="MS Gothic" w:hAnsi="Times New Roman" w:cs="Times New Roman"/>
+          <w:kern w:val="0"/>
+        </w:rPr>
+      </w:pPr>
+      <w:r>
+        <w:rPr>
+          <w:rFonts w:ascii="Times New Roman" w:hAnsi="Times New Roman" w:cs="Times New Roman"/>
+          <w:b/>
+          <w:bCs/>
+          <w:kern w:val="0"/>
+        </w:rPr>
+        <w:t>Presentation</w:t>
+      </w:r>
+    </w:p>
+    <w:p>
+      <w:pPr>
+        <w:autoSpaceDE w:val="0"/>
+        <w:autoSpaceDN w:val="0"/>
+        <w:adjustRightInd w:val="0"/>
+        <w:spacing w:after="0" w:line="240" w:lineRule="auto"/>
+        <w:rPr>
+          <w:rFonts w:ascii="Times New Roman" w:eastAsia="MS Gothic" w:hAnsi="Times New Roman" w:cs="Times New Roman"/>
+          <w:kern w:val="0"/>
+        </w:rPr>
+      </w:pPr>
+      <w:r>
+        <w:rPr>
+          <w:rFonts w:ascii="Times New Roman" w:hAnsi="Times New Roman" w:cs="Times New Roman"/>
+          <w:kern w:val="0"/>
+        </w:rPr>
+        <w:t>21. Which plots should be the headline figures? My instinct is: target robustness, QE robustness, target subsamples, and maybe one regime-interaction plot.</w:t>
+      </w:r>
+    </w:p>
+    <w:p>
+      <w:pPr>
+        <w:autoSpaceDE w:val="0"/>
+        <w:autoSpaceDN w:val="0"/>
+        <w:adjustRightInd w:val="0"/>
+        <w:spacing w:after="0" w:line="240" w:lineRule="auto"/>
+        <w:rPr>
+          <w:rFonts w:ascii="Times New Roman" w:eastAsia="MS Gothic" w:hAnsi="Times New Roman" w:cs="Times New Roman"/>
+          <w:kern w:val="0"/>
+        </w:rPr>
+      </w:pPr>
+      <w:r>
+        <w:rPr>
+          <w:rFonts w:ascii="Times New Roman" w:hAnsi="Times New Roman" w:cs="Times New Roman"/>
+          <w:kern w:val="0"/>
+        </w:rPr>
+        <w:t>22. Should I reduce the number of figures and put most robustness checks in an appendix?</w:t>
+      </w:r>
+    </w:p>
+    <w:p>
+      <w:pPr>
+        <w:autoSpaceDE w:val="0"/>
+        <w:autoSpaceDN w:val="0"/>
+        <w:adjustRightInd w:val="0"/>
+        <w:spacing w:after="0" w:line="240" w:lineRule="auto"/>
+        <w:rPr>
+          <w:rFonts w:ascii="Times New Roman" w:eastAsia="MS Gothic" w:hAnsi="Times New Roman" w:cs="Times New Roman"/>
+          <w:kern w:val="0"/>
+        </w:rPr>
+      </w:pPr>
+      <w:r>
+        <w:rPr>
+          <w:rFonts w:ascii="Times New Roman" w:hAnsi="Times New Roman" w:cs="Times New Roman"/>
+          <w:kern w:val="0"/>
+        </w:rPr>
+        <w:t>23. Would it be better to present tables of horizon 0, 5, 10, and 20 responses rather than many IRF plots?</w:t>
+      </w:r>
+    </w:p>
+    <w:p>
+      <w:pPr>
+        <w:autoSpaceDE w:val="0"/>
+        <w:autoSpaceDN w:val="0"/>
+        <w:adjustRightInd w:val="0"/>
+        <w:spacing w:after="0" w:line="240" w:lineRule="auto"/>
+        <w:rPr>
+          <w:rFonts w:ascii="Times New Roman" w:hAnsi="Times New Roman" w:cs="Times New Roman"/>
+          <w:kern w:val="0"/>
+        </w:rPr>
+      </w:pPr>
+      <w:r>
+        <w:rPr>
+          <w:rFonts w:ascii="Times New Roman" w:hAnsi="Times New Roman" w:cs="Times New Roman"/>
+          <w:kern w:val="0"/>
+        </w:rPr>
+        <w:t>24. How should I phrase the contribution: evidence on UK equity sensitivity to monetary shocks, evidence on asymmetric responses, or evidence that transmission changes across regimes?</w:t>
+      </w:r>
+    </w:p>
+    <w:p>
+      <w:pPr>
+        <w:autoSpaceDE w:val="0"/>
+        <w:autoSpaceDN w:val="0"/>
+        <w:adjustRightInd w:val="0"/>
+        <w:spacing w:after="0" w:line="240" w:lineRule="auto"/>
+        <w:rPr>
+          <w:rFonts w:ascii="Times New Roman" w:hAnsi="Times New Roman" w:cs="Times New Roman"/>
+          <w:b/>
+          <w:bCs/>
+          <w:kern w:val="0"/>
+        </w:rPr>
+      </w:pPr>
+    </w:p>
+    <w:p>
+      <w:pPr>
+        <w:autoSpaceDE w:val="0"/>
+        <w:autoSpaceDN w:val="0"/>
+        <w:adjustRightInd w:val="0"/>
+        <w:spacing w:after="0" w:line="240" w:lineRule="auto"/>
+        <w:rPr>
+          <w:rFonts w:ascii="Times New Roman" w:eastAsia="MS Gothic" w:hAnsi="Times New Roman" w:cs="Times New Roman"/>
+          <w:kern w:val="0"/>
+        </w:rPr>
+      </w:pPr>
+      <w:r>
+        <w:rPr>
+          <w:rFonts w:ascii="Times New Roman" w:hAnsi="Times New Roman" w:cs="Times New Roman"/>
+          <w:b/>
+          <w:bCs/>
+          <w:kern w:val="0"/>
+        </w:rPr>
+        <w:t>Very Direct Advisor Question</w:t>
+      </w:r>
+    </w:p>
+    <w:p>
+      <w:pPr>
+        <w:autoSpaceDE w:val="0"/>
+        <w:autoSpaceDN w:val="0"/>
+        <w:adjustRightInd w:val="0"/>
+        <w:spacing w:after="0" w:line="240" w:lineRule="auto"/>
+        <w:rPr>
+          <w:rFonts w:ascii="Times New Roman" w:hAnsi="Times New Roman" w:cs="Times New Roman"/>
+          <w:kern w:val="0"/>
+        </w:rPr>
+      </w:pPr>
+      <w:r>
+        <w:rPr>
+          <w:rFonts w:ascii="Times New Roman" w:hAnsi="Times New Roman" w:cs="Times New Roman"/>
+          <w:kern w:val="0"/>
+        </w:rPr>
+        <w:t>25. “Based on the results so far, what is the cleanest version of this project that would make a strong final submission?”</w:t>
+      </w:r>
+    </w:p>
+    <w:p>
+      <w:pPr>
+        <w:autoSpaceDE w:val="0"/>
+        <w:autoSpaceDN w:val="0"/>
+        <w:adjustRightInd w:val="0"/>
+        <w:spacing w:after="0" w:line="240" w:lineRule="auto"/>
+        <w:rPr>
+          <w:rFonts w:ascii="Times New Roman" w:hAnsi="Times New Roman" w:cs="Times New Roman"/>
+          <w:b/>
+          <w:bCs/>
+          <w:kern w:val="0"/>
         </w:rPr>
       </w:pPr>
     </w:p>
@@ -17206,6 +19449,95 @@
     </w:lvl>
   </w:abstractNum>
   <w:abstractNum w:abstractNumId="27" w15:restartNumberingAfterBreak="0">
+    <w:nsid w:val="54F50131"/>
+    <w:multiLevelType w:val="hybridMultilevel"/>
+    <w:tmpl w:val="DE4CB1C8"/>
+    <w:lvl w:ilvl="0" w:tplc="0809000F">
+      <w:start w:val="1"/>
+      <w:numFmt w:val="decimal"/>
+      <w:lvlText w:val="%1."/>
+      <w:lvlJc w:val="left"/>
+      <w:pPr>
+        <w:ind w:left="720" w:hanging="360"/>
+      </w:pPr>
+      <w:rPr>
+        <w:rFonts w:hint="default"/>
+      </w:rPr>
+    </w:lvl>
+    <w:lvl w:ilvl="1" w:tplc="08090019" w:tentative="1">
+      <w:start w:val="1"/>
+      <w:numFmt w:val="lowerLetter"/>
+      <w:lvlText w:val="%2."/>
+      <w:lvlJc w:val="left"/>
+      <w:pPr>
+        <w:ind w:left="1440" w:hanging="360"/>
+      </w:pPr>
+    </w:lvl>
+    <w:lvl w:ilvl="2" w:tplc="0809001B" w:tentative="1">
+      <w:start w:val="1"/>
+      <w:numFmt w:val="lowerRoman"/>
+      <w:lvlText w:val="%3."/>
+      <w:lvlJc w:val="right"/>
+      <w:pPr>
+        <w:ind w:left="2160" w:hanging="180"/>
+      </w:pPr>
+    </w:lvl>
+    <w:lvl w:ilvl="3" w:tplc="0809000F" w:tentative="1">
+      <w:start w:val="1"/>
+      <w:numFmt w:val="decimal"/>
+      <w:lvlText w:val="%4."/>
+      <w:lvlJc w:val="left"/>
+      <w:pPr>
+        <w:ind w:left="2880" w:hanging="360"/>
+      </w:pPr>
+    </w:lvl>
+    <w:lvl w:ilvl="4" w:tplc="08090019" w:tentative="1">
+      <w:start w:val="1"/>
+      <w:numFmt w:val="lowerLetter"/>
+      <w:lvlText w:val="%5."/>
+      <w:lvlJc w:val="left"/>
+      <w:pPr>
+        <w:ind w:left="3600" w:hanging="360"/>
+      </w:pPr>
+    </w:lvl>
+    <w:lvl w:ilvl="5" w:tplc="0809001B" w:tentative="1">
+      <w:start w:val="1"/>
+      <w:numFmt w:val="lowerRoman"/>
+      <w:lvlText w:val="%6."/>
+      <w:lvlJc w:val="right"/>
+      <w:pPr>
+        <w:ind w:left="4320" w:hanging="180"/>
+      </w:pPr>
+    </w:lvl>
+    <w:lvl w:ilvl="6" w:tplc="0809000F" w:tentative="1">
+      <w:start w:val="1"/>
+      <w:numFmt w:val="decimal"/>
+      <w:lvlText w:val="%7."/>
+      <w:lvlJc w:val="left"/>
+      <w:pPr>
+        <w:ind w:left="5040" w:hanging="360"/>
+      </w:pPr>
+    </w:lvl>
+    <w:lvl w:ilvl="7" w:tplc="08090019" w:tentative="1">
+      <w:start w:val="1"/>
+      <w:numFmt w:val="lowerLetter"/>
+      <w:lvlText w:val="%8."/>
+      <w:lvlJc w:val="left"/>
+      <w:pPr>
+        <w:ind w:left="5760" w:hanging="360"/>
+      </w:pPr>
+    </w:lvl>
+    <w:lvl w:ilvl="8" w:tplc="0809001B" w:tentative="1">
+      <w:start w:val="1"/>
+      <w:numFmt w:val="lowerRoman"/>
+      <w:lvlText w:val="%9."/>
+      <w:lvlJc w:val="right"/>
+      <w:pPr>
+        <w:ind w:left="6480" w:hanging="180"/>
+      </w:pPr>
+    </w:lvl>
+  </w:abstractNum>
+  <w:abstractNum w:abstractNumId="28" w15:restartNumberingAfterBreak="0">
     <w:nsid w:val="56CB7329"/>
     <w:multiLevelType w:val="hybridMultilevel"/>
     <w:tmpl w:val="C9100FAA"/>
@@ -17294,7 +19626,7 @@
       </w:pPr>
     </w:lvl>
   </w:abstractNum>
-  <w:abstractNum w:abstractNumId="28" w15:restartNumberingAfterBreak="0">
+  <w:abstractNum w:abstractNumId="29" w15:restartNumberingAfterBreak="0">
     <w:nsid w:val="6C1F34D9"/>
     <w:multiLevelType w:val="multilevel"/>
     <w:tmpl w:val="69729D6E"/>
@@ -17443,7 +19775,7 @@
       </w:rPr>
     </w:lvl>
   </w:abstractNum>
-  <w:abstractNum w:abstractNumId="29" w15:restartNumberingAfterBreak="0">
+  <w:abstractNum w:abstractNumId="30" w15:restartNumberingAfterBreak="0">
     <w:nsid w:val="6CE14144"/>
     <w:multiLevelType w:val="multilevel"/>
     <w:tmpl w:val="1DE0A39C"/>
@@ -17592,7 +19924,7 @@
       </w:rPr>
     </w:lvl>
   </w:abstractNum>
-  <w:abstractNum w:abstractNumId="30" w15:restartNumberingAfterBreak="0">
+  <w:abstractNum w:abstractNumId="31" w15:restartNumberingAfterBreak="0">
     <w:nsid w:val="70BF1278"/>
     <w:multiLevelType w:val="hybridMultilevel"/>
     <w:tmpl w:val="CF5A5A16"/>
@@ -17707,7 +20039,7 @@
       </w:rPr>
     </w:lvl>
   </w:abstractNum>
-  <w:abstractNum w:abstractNumId="31" w15:restartNumberingAfterBreak="0">
+  <w:abstractNum w:abstractNumId="32" w15:restartNumberingAfterBreak="0">
     <w:nsid w:val="72FE52F2"/>
     <w:multiLevelType w:val="hybridMultilevel"/>
     <w:tmpl w:val="3FA4F956"/>
@@ -17820,7 +20152,7 @@
       </w:rPr>
     </w:lvl>
   </w:abstractNum>
-  <w:abstractNum w:abstractNumId="32" w15:restartNumberingAfterBreak="0">
+  <w:abstractNum w:abstractNumId="33" w15:restartNumberingAfterBreak="0">
     <w:nsid w:val="752E2C40"/>
     <w:multiLevelType w:val="multilevel"/>
     <w:tmpl w:val="7FC2DA20"/>
@@ -17979,7 +20311,7 @@
     <w:abstractNumId w:val="22"/>
   </w:num>
   <w:num w:numId="4" w16cid:durableId="1800955875">
-    <w:abstractNumId w:val="31"/>
+    <w:abstractNumId w:val="32"/>
   </w:num>
   <w:num w:numId="5" w16cid:durableId="1931811932">
     <w:abstractNumId w:val="9"/>
@@ -17994,7 +20326,7 @@
     <w:abstractNumId w:val="26"/>
   </w:num>
   <w:num w:numId="9" w16cid:durableId="376053578">
-    <w:abstractNumId w:val="28"/>
+    <w:abstractNumId w:val="29"/>
   </w:num>
   <w:num w:numId="10" w16cid:durableId="711345486">
     <w:abstractNumId w:val="14"/>
@@ -18003,10 +20335,10 @@
     <w:abstractNumId w:val="13"/>
   </w:num>
   <w:num w:numId="12" w16cid:durableId="642318950">
-    <w:abstractNumId w:val="30"/>
+    <w:abstractNumId w:val="31"/>
   </w:num>
   <w:num w:numId="13" w16cid:durableId="1514563679">
-    <w:abstractNumId w:val="27"/>
+    <w:abstractNumId w:val="28"/>
   </w:num>
   <w:num w:numId="14" w16cid:durableId="265817463">
     <w:abstractNumId w:val="12"/>
@@ -18021,7 +20353,7 @@
     <w:abstractNumId w:val="19"/>
   </w:num>
   <w:num w:numId="18" w16cid:durableId="311300440">
-    <w:abstractNumId w:val="29"/>
+    <w:abstractNumId w:val="30"/>
   </w:num>
   <w:num w:numId="19" w16cid:durableId="1424687782">
     <w:abstractNumId w:val="15"/>
@@ -18060,13 +20392,16 @@
     <w:abstractNumId w:val="8"/>
   </w:num>
   <w:num w:numId="31" w16cid:durableId="1332951427">
-    <w:abstractNumId w:val="32"/>
+    <w:abstractNumId w:val="33"/>
   </w:num>
   <w:num w:numId="32" w16cid:durableId="1293829502">
     <w:abstractNumId w:val="20"/>
   </w:num>
   <w:num w:numId="33" w16cid:durableId="1698197418">
     <w:abstractNumId w:val="21"/>
+  </w:num>
+  <w:num w:numId="34" w16cid:durableId="1801341655">
+    <w:abstractNumId w:val="27"/>
   </w:num>
 </w:numbering>
 </file>

</xml_diff>